<commit_message>
Auto Push on Sun May 24 11:47:11 UTC 2026
</commit_message>
<xml_diff>
--- a/output/resume--fulltext.docx
+++ b/output/resume--fulltext.docx
@@ -44,19 +44,10 @@
                 <w:rPr>
                   <w:rStyle w:val="Hyperlink"/>
                 </w:rPr>
-                <w:t xml:space="preserve">holtzweb.com</w:t>
+                <w:t xml:space="preserve">marcusholtz.com</w:t>
               </w:r>
             </w:hyperlink>
           </w:p>
-        </w:tc>
-        <w:tc>
-          <w:tcPr>
-            <w:tcBorders>
-              <w:bottom w:val="single"/>
-            </w:tcBorders>
-            <w:vAlign w:val="bottom"/>
-          </w:tcPr>
-          <w:p/>
         </w:tc>
         <w:tc>
           <w:tcPr>
@@ -71,7 +62,7 @@
               <w:jc w:val="left"/>
             </w:pPr>
             <w:r>
-              <w:t xml:space="preserve">Littleton, CO</w:t>
+              <w:t xml:space="preserve">Denver, CO</w:t>
             </w:r>
           </w:p>
         </w:tc>
@@ -92,16 +83,13 @@
           </w:p>
         </w:tc>
         <w:tc>
-          <w:p/>
-        </w:tc>
-        <w:tc>
           <w:p>
             <w:pPr>
               <w:pStyle w:val="Compact"/>
               <w:jc w:val="left"/>
             </w:pPr>
             <w:r>
-              <w:t xml:space="preserve">marcusaholtz@gmail.com</w:t>
+              <w:t xml:space="preserve">contact@marcusholtz.com</w:t>
             </w:r>
           </w:p>
         </w:tc>
@@ -115,18 +103,114 @@
         <w:rPr>
           <w:b/>
         </w:rPr>
-        <w:t xml:space="preserve">Systems Engineer in Linux, virtualization, networking, containers, automation, and development.</w:t>
+        <w:t xml:space="preserve">Senior Systems Engineer</w:t>
+      </w:r>
+      <w:r>
+        <w:t xml:space="preserve"> </w:t>
+      </w:r>
+      <w:r>
+        <w:t xml:space="preserve">— Linux infrastructure, cloud architecture, DevOps, networking, and security.</w:t>
+      </w:r>
+    </w:p>
+    <w:p>
+      <w:pPr>
+        <w:pStyle w:val="BodyText"/>
+      </w:pPr>
+      <w:r>
+        <w:rPr>
+          <w:i/>
+        </w:rPr>
+        <w:t xml:space="preserve">DevOps Engineer · Platform Engineer · Site Reliability Engineer · Systems Administrator</w:t>
+      </w:r>
+    </w:p>
+    <w:p>
+      <w:pPr>
+        <w:pStyle w:val="BodyText"/>
+      </w:pPr>
+      <w:hyperlink r:id="rId21">
+        <w:r>
+          <w:rPr>
+            <w:rStyle w:val="Hyperlink"/>
+          </w:rPr>
+          <w:t xml:space="preserve">GitHub</w:t>
+        </w:r>
+      </w:hyperlink>
+      <w:r>
+        <w:t xml:space="preserve"> </w:t>
+      </w:r>
+      <w:r>
+        <w:t xml:space="preserve">|</w:t>
+      </w:r>
+      <w:r>
+        <w:t xml:space="preserve"> </w:t>
+      </w:r>
+      <w:hyperlink r:id="rId22">
+        <w:r>
+          <w:rPr>
+            <w:rStyle w:val="Hyperlink"/>
+          </w:rPr>
+          <w:t xml:space="preserve">LinkedIn</w:t>
+        </w:r>
+      </w:hyperlink>
+      <w:r>
+        <w:t xml:space="preserve"> </w:t>
+      </w:r>
+      <w:r>
+        <w:t xml:space="preserve">|</w:t>
+      </w:r>
+      <w:r>
+        <w:t xml:space="preserve"> </w:t>
+      </w:r>
+      <w:hyperlink r:id="rId23">
+        <w:r>
+          <w:rPr>
+            <w:rStyle w:val="Hyperlink"/>
+          </w:rPr>
+          <w:t xml:space="preserve">Blog</w:t>
+        </w:r>
+      </w:hyperlink>
+    </w:p>
+    <w:p>
+      <w:r>
+        <w:pict>
+          <v:rect style="width:0;height:1.5pt" o:hralign="center" o:hrstd="t" o:hr="t"/>
+        </w:pict>
       </w:r>
     </w:p>
     <w:p>
       <w:pPr>
         <w:pStyle w:val="Heading1"/>
       </w:pPr>
-      <w:bookmarkStart w:id="21" w:name="resume-info"/>
+      <w:bookmarkStart w:id="24" w:name="professional-summary"/>
+      <w:r>
+        <w:t xml:space="preserve">Professional Summary</w:t>
+      </w:r>
+      <w:bookmarkEnd w:id="24"/>
+    </w:p>
+    <w:p>
+      <w:pPr>
+        <w:pStyle w:val="FirstParagraph"/>
+      </w:pPr>
+      <w:r>
+        <w:t xml:space="preserve">Senior System Administrator, with 11+ years spanning infrastructure, web, and operations.</w:t>
+      </w:r>
+    </w:p>
+    <w:p>
+      <w:r>
+        <w:pict>
+          <v:rect style="width:0;height:1.5pt" o:hralign="center" o:hrstd="t" o:hr="t"/>
+        </w:pict>
+      </w:r>
+    </w:p>
+    <w:p>
+      <w:pPr>
+        <w:pStyle w:val="Heading1"/>
+      </w:pPr>
+      <w:bookmarkStart w:id="25" w:name="resume-info"/>
       <w:r>
         <w:t xml:space="preserve">Resume Info</w:t>
       </w:r>
-      <w:bookmarkEnd w:id="21"/>
+      <w:bookmarkEnd w:id="25"/>
     </w:p>
     <w:p>
       <w:pPr>
@@ -138,7 +222,7 @@
       <w:r>
         <w:t xml:space="preserve"> </w:t>
       </w:r>
-      <w:hyperlink r:id="rId22">
+      <w:hyperlink r:id="rId26">
         <w:r>
           <w:rPr>
             <w:rStyle w:val="Hyperlink"/>
@@ -156,7 +240,7 @@
       <w:r>
         <w:t xml:space="preserve"> </w:t>
       </w:r>
-      <w:hyperlink r:id="rId23">
+      <w:hyperlink r:id="rId27">
         <w:r>
           <w:rPr>
             <w:rStyle w:val="Hyperlink"/>
@@ -174,7 +258,7 @@
       <w:r>
         <w:t xml:space="preserve"> </w:t>
       </w:r>
-      <w:hyperlink r:id="rId24">
+      <w:hyperlink r:id="rId28">
         <w:r>
           <w:rPr>
             <w:rStyle w:val="Hyperlink"/>
@@ -201,7 +285,7 @@
       <w:r>
         <w:t xml:space="preserve"> </w:t>
       </w:r>
-      <w:hyperlink r:id="rId25">
+      <w:hyperlink r:id="rId29">
         <w:r>
           <w:rPr>
             <w:rStyle w:val="Hyperlink"/>
@@ -211,24 +295,31 @@
       </w:hyperlink>
     </w:p>
     <w:p>
+      <w:r>
+        <w:pict>
+          <v:rect style="width:0;height:1.5pt" o:hralign="center" o:hrstd="t" o:hr="t"/>
+        </w:pict>
+      </w:r>
+    </w:p>
+    <w:p>
       <w:pPr>
         <w:pStyle w:val="Heading1"/>
       </w:pPr>
-      <w:bookmarkStart w:id="26" w:name="skills"/>
+      <w:bookmarkStart w:id="30" w:name="skills"/>
       <w:r>
         <w:t xml:space="preserve">Skills</w:t>
       </w:r>
-      <w:bookmarkEnd w:id="26"/>
+      <w:bookmarkEnd w:id="30"/>
     </w:p>
     <w:p>
       <w:pPr>
         <w:pStyle w:val="Heading2"/>
       </w:pPr>
-      <w:bookmarkStart w:id="27" w:name="linux-system-administration"/>
-      <w:r>
-        <w:t xml:space="preserve">Linux System Administration</w:t>
-      </w:r>
-      <w:bookmarkEnd w:id="27"/>
+      <w:bookmarkStart w:id="31" w:name="linux-systems-administration"/>
+      <w:r>
+        <w:t xml:space="preserve">Linux Systems Administration</w:t>
+      </w:r>
+      <w:bookmarkEnd w:id="31"/>
     </w:p>
     <w:p>
       <w:pPr>
@@ -239,7 +330,7 @@
         <w:pStyle w:val="Compact"/>
       </w:pPr>
       <w:r>
-        <w:t xml:space="preserve">• Maintain a reliable and secure hybrid cloud environment for development and serving resources using tools such as SSH/tunneling, SSL, UDP hole punching, VPN, and single sign-on identity management.</w:t>
+        <w:t xml:space="preserve">Maintain reliable hybrid cloud environments using SSH tunneling, SSL/TLS, VPN, and SSO identity management across production and development tiers.</w:t>
       </w:r>
     </w:p>
     <w:p>
@@ -251,7 +342,7 @@
         <w:pStyle w:val="Compact"/>
       </w:pPr>
       <w:r>
-        <w:t xml:space="preserve">• Monitor and log: performance monitoring, network bandwidth usage, memory allocation, hard drive status, and application uptime using Glances, Netdata, Prometheus, Grafana, ELK stack, &amp; Diskover.</w:t>
+        <w:t xml:space="preserve">Monitor and log performance, bandwidth, memory, disk health, and application uptime using Glances, Netdata, Prometheus, Grafana, Loki, and Diskover.</w:t>
       </w:r>
     </w:p>
     <w:p>
@@ -263,18 +354,18 @@
         <w:pStyle w:val="Compact"/>
       </w:pPr>
       <w:r>
-        <w:t xml:space="preserve">• Cross-platform systems administration experience: Ability to install, configure, maintain, and document a variety of production-level Unix based systems: Debian, CentOS, Ubuntu, FreeBSD.</w:t>
+        <w:t xml:space="preserve">Cross-platform administration across Debian, Ubuntu, CentOS, RHEL, and FreeBSD production systems.</w:t>
       </w:r>
     </w:p>
     <w:p>
       <w:pPr>
         <w:pStyle w:val="Heading2"/>
       </w:pPr>
-      <w:bookmarkStart w:id="28" w:name="virtualization"/>
+      <w:bookmarkStart w:id="32" w:name="virtualization"/>
       <w:r>
         <w:t xml:space="preserve">Virtualization</w:t>
       </w:r>
-      <w:bookmarkEnd w:id="28"/>
+      <w:bookmarkEnd w:id="32"/>
     </w:p>
     <w:p>
       <w:pPr>
@@ -285,7 +376,7 @@
         <w:pStyle w:val="Compact"/>
       </w:pPr>
       <w:r>
-        <w:t xml:space="preserve">• System virtualization platforms: Docker, QEMU, KVM - with virt-io’s 9p filesystem to increase io speed.</w:t>
+        <w:t xml:space="preserve">Manage system virtualization with Docker, QEMU, KVM, Proxmox, and VMware ESXi; leverage virtio’s 9p filesystem for improved I/O throughput.</w:t>
       </w:r>
     </w:p>
     <w:p>
@@ -297,18 +388,18 @@
         <w:pStyle w:val="Compact"/>
       </w:pPr>
       <w:r>
-        <w:t xml:space="preserve">• Created system templates for cloning, backing up, and restoring servers across multiple platforms and formats: CentOS, Ubuntu, FreeBSD, Debian in vmdk, vdi, vhdx, qcow2, &amp; raw filetypes.</w:t>
+        <w:t xml:space="preserve">Produce system templates for cloning, backup, and cross-platform restoration in vmdk, vdi, vhdx, qcow2, and raw formats.</w:t>
       </w:r>
     </w:p>
     <w:p>
       <w:pPr>
         <w:pStyle w:val="Heading2"/>
       </w:pPr>
-      <w:bookmarkStart w:id="29" w:name="containers"/>
-      <w:r>
-        <w:t xml:space="preserve">Containers</w:t>
-      </w:r>
-      <w:bookmarkEnd w:id="29"/>
+      <w:bookmarkStart w:id="33" w:name="containers-orchestration"/>
+      <w:r>
+        <w:t xml:space="preserve">Containers &amp; Orchestration</w:t>
+      </w:r>
+      <w:bookmarkEnd w:id="33"/>
     </w:p>
     <w:p>
       <w:pPr>
@@ -319,7 +410,7 @@
         <w:pStyle w:val="Compact"/>
       </w:pPr>
       <w:r>
-        <w:t xml:space="preserve">• Create, build, deploy containers using LXC and containerd using: docker, dockerfile, docker compose, docker networking, docker hub, github, github actions, proxmox.</w:t>
+        <w:t xml:space="preserve">Design, build, and deploy containers using Docker, Docker Compose, LXC, and containerd; maintain images on Docker Hub and GitHub/GitLab registries.</w:t>
       </w:r>
     </w:p>
     <w:p>
@@ -331,18 +422,18 @@
         <w:pStyle w:val="Compact"/>
       </w:pPr>
       <w:r>
-        <w:t xml:space="preserve">• Experience with distributed storage technologies like NFS, Ceph, S3 as well as dynamic resource management frameworks: Kubernetes, Docker Swarm.</w:t>
+        <w:t xml:space="preserve">Work with distributed storage technologies (NFS, Ceph, S3) and cluster orchestration (Kubernetes, Docker Swarm).</w:t>
       </w:r>
     </w:p>
     <w:p>
       <w:pPr>
         <w:pStyle w:val="Heading2"/>
       </w:pPr>
-      <w:bookmarkStart w:id="30" w:name="servers"/>
-      <w:r>
-        <w:t xml:space="preserve">Servers</w:t>
-      </w:r>
-      <w:bookmarkEnd w:id="30"/>
+      <w:bookmarkStart w:id="34" w:name="security-hardening-devsecops"/>
+      <w:r>
+        <w:t xml:space="preserve">Security, Hardening &amp; DevSecOps</w:t>
+      </w:r>
+      <w:bookmarkEnd w:id="34"/>
     </w:p>
     <w:p>
       <w:pPr>
@@ -353,7 +444,7 @@
         <w:pStyle w:val="Compact"/>
       </w:pPr>
       <w:r>
-        <w:t xml:space="preserve">• Deployment and management of headless, bare metal servers in off site datacenter using the model:</w:t>
+        <w:t xml:space="preserve">Deploy and tune Web Application Firewalls (WAF), IDS/IPS (SecurityOnion, Suricata, nzyme), and behavioral firewalls (CrowdSec) across cloud and on-prem environments.</w:t>
       </w:r>
     </w:p>
     <w:p>
@@ -365,7 +456,7 @@
         <w:pStyle w:val="Compact"/>
       </w:pPr>
       <w:r>
-        <w:t xml:space="preserve">Debian image &gt; Proxmox baremetal &gt; isolated containers &gt; pfsense routing &gt; haproxy &gt; public internet</w:t>
+        <w:t xml:space="preserve">Apply DevSecOps practices: WAF smoke testing against OWASP Top 10 vectors, secrets management in CI/CD pipelines, and cloud security hardening across containerized services.</w:t>
       </w:r>
     </w:p>
     <w:p>
@@ -377,18 +468,18 @@
         <w:pStyle w:val="Compact"/>
       </w:pPr>
       <w:r>
-        <w:t xml:space="preserve">• Configured and deployed ssl certificate management with reverse proxy, added SecurityOnion as an IDS within virtualized infrastructure with additional SPAN port to duplicate internal traffic.</w:t>
+        <w:t xml:space="preserve">Implement zero-trust network access, SSO with ForwardAuth, geo-IP filtering, and VPN obfuscation.</w:t>
       </w:r>
     </w:p>
     <w:p>
       <w:pPr>
         <w:pStyle w:val="Heading2"/>
       </w:pPr>
-      <w:bookmarkStart w:id="31" w:name="disaster-recovery"/>
-      <w:r>
-        <w:t xml:space="preserve">Disaster Recovery</w:t>
-      </w:r>
-      <w:bookmarkEnd w:id="31"/>
+      <w:bookmarkStart w:id="35" w:name="networking-virtual-physical"/>
+      <w:r>
+        <w:t xml:space="preserve">Networking (Virtual &amp; Physical)</w:t>
+      </w:r>
+      <w:bookmarkEnd w:id="35"/>
     </w:p>
     <w:p>
       <w:pPr>
@@ -399,21 +490,7 @@
         <w:pStyle w:val="Compact"/>
       </w:pPr>
       <w:r>
-        <w:t xml:space="preserve">• Built, configured, tested, and deployed Proxmox high availability ZFS solution featuring: Incremental 15min snapshotting for disaster recovery using</w:t>
-      </w:r>
-      <w:r>
-        <w:t xml:space="preserve"> </w:t>
-      </w:r>
-      <w:hyperlink r:id="rId32">
-        <w:r>
-          <w:rPr>
-            <w:rStyle w:val="Hyperlink"/>
-          </w:rPr>
-          <w:t xml:space="preserve">PBS2, cv4pve and Sanoid</w:t>
-        </w:r>
-      </w:hyperlink>
-      <w:r>
-        <w:t xml:space="preserve">.</w:t>
+        <w:t xml:space="preserve">Design and document network infrastructure with VLAN segregation, virtualized edge routing (OPNsense, pfSense), and site-to-site WireGuard VPNs.</w:t>
       </w:r>
     </w:p>
     <w:p>
@@ -425,18 +502,30 @@
         <w:pStyle w:val="Compact"/>
       </w:pPr>
       <w:r>
-        <w:t xml:space="preserve">• Developed and maintain system backup infrastructure including individual machine images, datastores, and off-site backups.</w:t>
+        <w:t xml:space="preserve">Operate technologies including OpenVSwitch, HAProxy, Traefik, and Nginx for load balancing and reverse proxying; Unbound, PowerDNS, DNSSEC, DNSCrypt, and DNS-over-TLS for DNS infrastructure.</w:t>
+      </w:r>
+    </w:p>
+    <w:p>
+      <w:pPr>
+        <w:numPr>
+          <w:ilvl w:val="0"/>
+          <w:numId w:val="1007"/>
+        </w:numPr>
+        <w:pStyle w:val="Compact"/>
+      </w:pPr>
+      <w:r>
+        <w:t xml:space="preserve">Deploy virtual network infrastructure on VMware ESXi, Proxmox, Hyper-V, and Xen.</w:t>
       </w:r>
     </w:p>
     <w:p>
       <w:pPr>
         <w:pStyle w:val="Heading2"/>
       </w:pPr>
-      <w:bookmarkStart w:id="33" w:name="devops"/>
-      <w:r>
-        <w:t xml:space="preserve">DevOps</w:t>
-      </w:r>
-      <w:bookmarkEnd w:id="33"/>
+      <w:bookmarkStart w:id="36" w:name="disaster-recovery-storage"/>
+      <w:r>
+        <w:t xml:space="preserve">Disaster Recovery &amp; Storage</w:t>
+      </w:r>
+      <w:bookmarkEnd w:id="36"/>
     </w:p>
     <w:p>
       <w:pPr>
@@ -447,7 +536,7 @@
         <w:pStyle w:val="Compact"/>
       </w:pPr>
       <w:r>
-        <w:t xml:space="preserve">• Knowledge of cloud infrastructure (AWS, Azure, GCP, Oracle) &amp; orchestration (Chef, Puppet, Ansible, SaltStack, Terraform, Helm, OpenStack).</w:t>
+        <w:t xml:space="preserve">Architect and maintain enterprise-grade Proxmox high-availability ZFS solutions with 15-minute incremental snapshots, Proxmox Backup Server 2, and off-site replication via Sanoid/Syncoid.</w:t>
       </w:r>
     </w:p>
     <w:p>
@@ -459,30 +548,18 @@
         <w:pStyle w:val="Compact"/>
       </w:pPr>
       <w:r>
-        <w:t xml:space="preserve">• Experience with the core AWS services, including ALB, ELB, EC2, RDS, and S3.</w:t>
-      </w:r>
-    </w:p>
-    <w:p>
-      <w:pPr>
-        <w:numPr>
-          <w:ilvl w:val="0"/>
-          <w:numId w:val="1008"/>
-        </w:numPr>
-        <w:pStyle w:val="Compact"/>
-      </w:pPr>
-      <w:r>
-        <w:t xml:space="preserve">• A proactive approach to spotting problems, areas for improvement, and performance bottlenecks.</w:t>
+        <w:t xml:space="preserve">Manage ZFS pool design with tuned compression, deduplication, and snapshot scheduling across cluster migrations.</w:t>
       </w:r>
     </w:p>
     <w:p>
       <w:pPr>
         <w:pStyle w:val="Heading2"/>
       </w:pPr>
-      <w:bookmarkStart w:id="34" w:name="networking-virtual-and-physical"/>
-      <w:r>
-        <w:t xml:space="preserve">Networking (virtual and physical)</w:t>
-      </w:r>
-      <w:bookmarkEnd w:id="34"/>
+      <w:bookmarkStart w:id="37" w:name="devops-automation"/>
+      <w:r>
+        <w:t xml:space="preserve">DevOps &amp; Automation</w:t>
+      </w:r>
+      <w:bookmarkEnd w:id="37"/>
     </w:p>
     <w:p>
       <w:pPr>
@@ -493,7 +570,7 @@
         <w:pStyle w:val="Compact"/>
       </w:pPr>
       <w:r>
-        <w:t xml:space="preserve">• Documentation: Details with visuals of network infrastructure, system architecture, process, and policies.</w:t>
+        <w:t xml:space="preserve">Proficient in Infrastructure as Code (IaC) and configuration management: Ansible, Terraform, Helm, ArgoCD, Chef, Puppet, SaltStack, OpenStack.</w:t>
       </w:r>
     </w:p>
     <w:p>
@@ -505,7 +582,7 @@
         <w:pStyle w:val="Compact"/>
       </w:pPr>
       <w:r>
-        <w:t xml:space="preserve">• Virtual Routing: Administered networking in virtualized environments, including virtualized edge routing with pfSense.</w:t>
+        <w:t xml:space="preserve">Build and maintain CI/CD pipelines with GitHub Actions, GitLab CI, Jenkins, and self-hosted runners.</w:t>
       </w:r>
     </w:p>
     <w:p>
@@ -517,30 +594,18 @@
         <w:pStyle w:val="Compact"/>
       </w:pPr>
       <w:r>
-        <w:t xml:space="preserve">• Technologies used: Linux, OpenVSwitch, SPAN port for SecurityOnion, VLAN segregation, DNS, BIND, VPNs, DNSoverTLS,</w:t>
-      </w:r>
-    </w:p>
-    <w:p>
-      <w:pPr>
-        <w:numPr>
-          <w:ilvl w:val="0"/>
-          <w:numId w:val="1009"/>
-        </w:numPr>
-        <w:pStyle w:val="Compact"/>
-      </w:pPr>
-      <w:r>
-        <w:t xml:space="preserve">• Installation of virtual network infrastructure using: VMware ESXi, Proxmox, Hyper-V, and Xen.</w:t>
+        <w:t xml:space="preserve">Use of core AWS, Azure, GCP, and Oracle Cloud services (ALB, ELB, EC2, RDS, S3).</w:t>
       </w:r>
     </w:p>
     <w:p>
       <w:pPr>
         <w:pStyle w:val="Heading2"/>
       </w:pPr>
-      <w:bookmarkStart w:id="35" w:name="domain-administration"/>
-      <w:r>
-        <w:t xml:space="preserve">Domain Administration</w:t>
-      </w:r>
-      <w:bookmarkEnd w:id="35"/>
+      <w:bookmarkStart w:id="38" w:name="identity-access-management-iam"/>
+      <w:r>
+        <w:t xml:space="preserve">Identity &amp; Access Management (IAM)</w:t>
+      </w:r>
+      <w:bookmarkEnd w:id="38"/>
     </w:p>
     <w:p>
       <w:pPr>
@@ -551,7 +616,7 @@
         <w:pStyle w:val="Compact"/>
       </w:pPr>
       <w:r>
-        <w:t xml:space="preserve">• Active Directory, SCCM, Domain Trust, Domain Controller, FSMO roles, Active Director Replication, Group Policy, OpenLDAP, RADIUS</w:t>
+        <w:t xml:space="preserve">Configure and maintain Active Directory, SCCM, Domain Controllers, FSMO roles, Group Policy, and AD replication.</w:t>
       </w:r>
     </w:p>
     <w:p>
@@ -563,18 +628,30 @@
         <w:pStyle w:val="Compact"/>
       </w:pPr>
       <w:r>
-        <w:t xml:space="preserve">• Identity Management and Single sign-on (SSO) (Kerberos, OAuth2, and OpenID Connect; Keycloak)</w:t>
+        <w:t xml:space="preserve">Deploy and manage SSO and identity federation with Authentik and Keycloak using Kerberos, OAuth2, and OpenID Connect.</w:t>
+      </w:r>
+    </w:p>
+    <w:p>
+      <w:pPr>
+        <w:numPr>
+          <w:ilvl w:val="0"/>
+          <w:numId w:val="1010"/>
+        </w:numPr>
+        <w:pStyle w:val="Compact"/>
+      </w:pPr>
+      <w:r>
+        <w:t xml:space="preserve">Administer OpenLDAP and RADIUS for on-premise and hybrid identity environments.</w:t>
       </w:r>
     </w:p>
     <w:p>
       <w:pPr>
         <w:pStyle w:val="Heading2"/>
       </w:pPr>
-      <w:bookmarkStart w:id="36" w:name="data-analytics"/>
-      <w:r>
-        <w:t xml:space="preserve">Data Analytics</w:t>
-      </w:r>
-      <w:bookmarkEnd w:id="36"/>
+      <w:bookmarkStart w:id="39" w:name="web-front-end-development"/>
+      <w:r>
+        <w:t xml:space="preserve">Web &amp; Front-End Development</w:t>
+      </w:r>
+      <w:bookmarkEnd w:id="39"/>
     </w:p>
     <w:p>
       <w:pPr>
@@ -585,7 +662,7 @@
         <w:pStyle w:val="Compact"/>
       </w:pPr>
       <w:r>
-        <w:t xml:space="preserve">• Created actionable reports weekly/monthly to customers and team members. Keeping them informed of how their efforts were going, what they should expect, allowing us to make data-driven decisions – all with visuals and detailed explinations.</w:t>
+        <w:t xml:space="preserve">Design and build custom front-end interfaces and backend systems using TypeScript, JavaScript, and modern CMSs including WordPress and Drupal.</w:t>
       </w:r>
     </w:p>
     <w:p>
@@ -597,7 +674,7 @@
         <w:pStyle w:val="Compact"/>
       </w:pPr>
       <w:r>
-        <w:t xml:space="preserve">• Keep metrics of every varriety, to allow cross-referencal contrasts.</w:t>
+        <w:t xml:space="preserve">Integrate data from external APIs, election databases, employee directories, and interactive mapping services.</w:t>
       </w:r>
     </w:p>
     <w:p>
@@ -609,18 +686,18 @@
         <w:pStyle w:val="Compact"/>
       </w:pPr>
       <w:r>
-        <w:t xml:space="preserve">• Love to set up A/B tests to see analytics and insights in action</w:t>
+        <w:t xml:space="preserve">Enforce web standards, ADA/WCAG compliance, and SEO best practices across all client sites.</w:t>
       </w:r>
     </w:p>
     <w:p>
       <w:pPr>
         <w:pStyle w:val="Heading2"/>
       </w:pPr>
-      <w:bookmarkStart w:id="37" w:name="project-ownership"/>
-      <w:r>
-        <w:t xml:space="preserve">Project Ownership</w:t>
-      </w:r>
-      <w:bookmarkEnd w:id="37"/>
+      <w:bookmarkStart w:id="40" w:name="data-analytics-reporting"/>
+      <w:r>
+        <w:t xml:space="preserve">Data Analytics &amp; Reporting</w:t>
+      </w:r>
+      <w:bookmarkEnd w:id="40"/>
     </w:p>
     <w:p>
       <w:pPr>
@@ -631,7 +708,7 @@
         <w:pStyle w:val="Compact"/>
       </w:pPr>
       <w:r>
-        <w:t xml:space="preserve">• I love to solve problems: Often taking the broad look to spot issues and inefficiencies from a mile away, backing them with suggested solutions, and personally implementing them.</w:t>
+        <w:t xml:space="preserve">Produce weekly and monthly stakeholder reports using data-driven insights, A/B test results, and visualized metrics.</w:t>
       </w:r>
     </w:p>
     <w:p>
@@ -643,30 +720,25 @@
         <w:pStyle w:val="Compact"/>
       </w:pPr>
       <w:r>
-        <w:t xml:space="preserve">• Personal pride in my work to ensure that every customer has a great experience with what I build.</w:t>
-      </w:r>
-    </w:p>
-    <w:p>
-      <w:pPr>
-        <w:numPr>
-          <w:ilvl w:val="0"/>
-          <w:numId w:val="1012"/>
-        </w:numPr>
-        <w:pStyle w:val="Compact"/>
-      </w:pPr>
-      <w:r>
-        <w:t xml:space="preserve">• Work with many kinds of clients, in a wide variety of fields.</w:t>
-      </w:r>
-    </w:p>
-    <w:p>
-      <w:pPr>
-        <w:pStyle w:val="Heading2"/>
-      </w:pPr>
-      <w:bookmarkStart w:id="38" w:name="research"/>
-      <w:r>
-        <w:t xml:space="preserve">Research</w:t>
-      </w:r>
-      <w:bookmarkEnd w:id="38"/>
+        <w:t xml:space="preserve">Execute SEO/SEM campaigns across web, email, and ad channels — consistently improving organic traffic and conversion.</w:t>
+      </w:r>
+    </w:p>
+    <w:p>
+      <w:r>
+        <w:pict>
+          <v:rect style="width:0;height:1.5pt" o:hralign="center" o:hrstd="t" o:hr="t"/>
+        </w:pict>
+      </w:r>
+    </w:p>
+    <w:p>
+      <w:pPr>
+        <w:pStyle w:val="Heading1"/>
+      </w:pPr>
+      <w:bookmarkStart w:id="41" w:name="certifications"/>
+      <w:r>
+        <w:t xml:space="preserve">Certifications</w:t>
+      </w:r>
+      <w:bookmarkEnd w:id="41"/>
     </w:p>
     <w:p>
       <w:pPr>
@@ -677,7 +749,16 @@
         <w:pStyle w:val="Compact"/>
       </w:pPr>
       <w:r>
-        <w:t xml:space="preserve">• Able to find a solution through vendor documentation, question and answer websites, and related forums.</w:t>
+        <w:rPr>
+          <w:b/>
+        </w:rPr>
+        <w:t xml:space="preserve">CompTIA Network+</w:t>
+      </w:r>
+      <w:r>
+        <w:t xml:space="preserve"> </w:t>
+      </w:r>
+      <w:r>
+        <w:t xml:space="preserve">— Vendor-neutral validation of core networking, troubleshooting, and infrastructure management competencies.</w:t>
       </w:r>
     </w:p>
     <w:p>
@@ -689,7 +770,16 @@
         <w:pStyle w:val="Compact"/>
       </w:pPr>
       <w:r>
-        <w:t xml:space="preserve">• Excelent at researching client’s brands, industries, and markets to very quickly come up with a plan to fit their needs.</w:t>
+        <w:rPr>
+          <w:b/>
+        </w:rPr>
+        <w:t xml:space="preserve">CompTIA Security+</w:t>
+      </w:r>
+      <w:r>
+        <w:t xml:space="preserve"> </w:t>
+      </w:r>
+      <w:r>
+        <w:t xml:space="preserve">— Industry and government-recognized certification covering threat analysis, incident response, digital forensics, and enterprise risk mitigation.</w:t>
       </w:r>
     </w:p>
     <w:p>
@@ -701,18 +791,2001 @@
         <w:pStyle w:val="Compact"/>
       </w:pPr>
       <w:r>
-        <w:t xml:space="preserve">• Experience architecting system layouts.</w:t>
-      </w:r>
+        <w:rPr>
+          <w:i/>
+        </w:rPr>
+        <w:t xml:space="preserve">Pursuing:</w:t>
+      </w:r>
+      <w:r>
+        <w:t xml:space="preserve"> </w:t>
+      </w:r>
+      <w:r>
+        <w:t xml:space="preserve">CISSP (Q4 2026) · CKA (Q2 2027) · RHCE (Q4 2027) · OSCP (Q2 2028)</w:t>
+      </w:r>
+    </w:p>
+    <w:p>
+      <w:r>
+        <w:pict>
+          <v:rect style="width:0;height:1.5pt" o:hralign="center" o:hrstd="t" o:hr="t"/>
+        </w:pict>
+      </w:r>
+    </w:p>
+    <w:p>
+      <w:pPr>
+        <w:pStyle w:val="Heading1"/>
+      </w:pPr>
+      <w:bookmarkStart w:id="42" w:name="technical-projects"/>
+      <w:r>
+        <w:t xml:space="preserve">Technical Projects</w:t>
+      </w:r>
+      <w:bookmarkEnd w:id="42"/>
     </w:p>
     <w:p>
       <w:pPr>
         <w:pStyle w:val="Heading2"/>
       </w:pPr>
-      <w:bookmarkStart w:id="39" w:name="web-development"/>
+      <w:bookmarkStart w:id="43" w:name="devops-automation-1"/>
+      <w:r>
+        <w:t xml:space="preserve">DevOps &amp; Automation</w:t>
+      </w:r>
+      <w:bookmarkEnd w:id="43"/>
+    </w:p>
+    <w:p>
+      <w:pPr>
+        <w:pStyle w:val="FirstParagraph"/>
+      </w:pPr>
+      <w:r>
+        <w:rPr>
+          <w:b/>
+        </w:rPr>
+        <w:t xml:space="preserve">Self-Hosted GitLab with CI Runners &amp; TLS</w:t>
+      </w:r>
+      <w:r>
+        <w:t xml:space="preserve"> </w:t>
+      </w:r>
+      <w:r>
+        <w:t xml:space="preserve">Full GitLab Omnibus deployment with registered CI runners and automated TLS certificate management via Traefik. Provides a completely private, git-controlled CI/CD platform with a demonstration project included out of the box.</w:t>
+      </w:r>
+      <w:r>
+        <w:t xml:space="preserve"> </w:t>
+      </w:r>
+      <w:hyperlink r:id="rId44">
+        <w:r>
+          <w:rPr>
+            <w:rStyle w:val="Hyperlink"/>
+          </w:rPr>
+          <w:t xml:space="preserve">github.com/MarcusHoltz/docker-gitlab-runner</w:t>
+        </w:r>
+      </w:hyperlink>
+    </w:p>
+    <w:p>
+      <w:pPr>
+        <w:pStyle w:val="BodyText"/>
+      </w:pPr>
+      <w:r>
+        <w:rPr>
+          <w:b/>
+        </w:rPr>
+        <w:t xml:space="preserve">Auto-Updating Resume Pipeline</w:t>
+      </w:r>
+      <w:r>
+        <w:t xml:space="preserve"> </w:t>
+      </w:r>
+      <w:r>
+        <w:t xml:space="preserve">CI/CD pipeline that rebuilds and publishes a polished resume every day via GitHub Actions. Containerized LaTeX/Pandoc rendering produces a versioned, timestamped PDF artifact on each run — the pipeline itself is the portfolio piece.</w:t>
+      </w:r>
+      <w:r>
+        <w:t xml:space="preserve"> </w:t>
+      </w:r>
+      <w:hyperlink r:id="rId45">
+        <w:r>
+          <w:rPr>
+            <w:rStyle w:val="Hyperlink"/>
+          </w:rPr>
+          <w:t xml:space="preserve">github.com/MarcusHoltz/resume-generator</w:t>
+        </w:r>
+      </w:hyperlink>
+    </w:p>
+    <w:p>
+      <w:pPr>
+        <w:pStyle w:val="BodyText"/>
+      </w:pPr>
+      <w:r>
+        <w:rPr>
+          <w:b/>
+        </w:rPr>
+        <w:t xml:space="preserve">Docker Secrets &amp; Vault Management</w:t>
+      </w:r>
+      <w:r>
+        <w:t xml:space="preserve"> </w:t>
+      </w:r>
+      <w:r>
+        <w:t xml:space="preserve">Secure secrets injection pipeline using Docker Secrets integrated with GitLab CI. Eliminates plaintext credentials from pipelines and repositories — secrets never touch disk unencrypted.</w:t>
+      </w:r>
+      <w:r>
+        <w:t xml:space="preserve"> </w:t>
+      </w:r>
+      <w:hyperlink r:id="rId46">
+        <w:r>
+          <w:rPr>
+            <w:rStyle w:val="Hyperlink"/>
+          </w:rPr>
+          <w:t xml:space="preserve">github.com/MarcusHoltz/setting-up-docker-secrets-in-gitlab</w:t>
+        </w:r>
+      </w:hyperlink>
+    </w:p>
+    <w:p>
+      <w:pPr>
+        <w:pStyle w:val="BodyText"/>
+      </w:pPr>
+      <w:r>
+        <w:rPr>
+          <w:b/>
+        </w:rPr>
+        <w:t xml:space="preserve">Traefik Docker Cron Scheduler</w:t>
+      </w:r>
+      <w:r>
+        <w:t xml:space="preserve"> </w:t>
+      </w:r>
+      <w:r>
+        <w:t xml:space="preserve">Toggles Traefik-fronted services on and off based on a configurable cron schedule — automatically shutting down non-essential containers after hours without removing their configuration.</w:t>
+      </w:r>
+      <w:r>
+        <w:t xml:space="preserve"> </w:t>
+      </w:r>
+      <w:hyperlink r:id="rId47">
+        <w:r>
+          <w:rPr>
+            <w:rStyle w:val="Hyperlink"/>
+          </w:rPr>
+          <w:t xml:space="preserve">github.com/MarcusHoltz/traefik-docker-cron</w:t>
+        </w:r>
+      </w:hyperlink>
+    </w:p>
+    <w:p>
+      <w:pPr>
+        <w:pStyle w:val="BodyText"/>
+      </w:pPr>
+      <w:r>
+        <w:rPr>
+          <w:b/>
+        </w:rPr>
+        <w:t xml:space="preserve">Proxmox 8→9 Upgrade Script</w:t>
+      </w:r>
+      <w:r>
+        <w:t xml:space="preserve"> </w:t>
+      </w:r>
+      <w:r>
+        <w:t xml:space="preserve">Automated in-place upgrade path for Proxmox VE with preflight safety checks, cluster awareness, and Proxmox Backup Server 2 compatibility verification — no manual steps, no surprises.</w:t>
+      </w:r>
+      <w:r>
+        <w:t xml:space="preserve"> </w:t>
+      </w:r>
+      <w:hyperlink r:id="rId48">
+        <w:r>
+          <w:rPr>
+            <w:rStyle w:val="Hyperlink"/>
+          </w:rPr>
+          <w:t xml:space="preserve">github.com/MarcusHoltz/proxmox-8to9-upgrade</w:t>
+        </w:r>
+      </w:hyperlink>
+    </w:p>
+    <w:p>
+      <w:pPr>
+        <w:pStyle w:val="BodyText"/>
+      </w:pPr>
+      <w:r>
+        <w:rPr>
+          <w:b/>
+        </w:rPr>
+        <w:t xml:space="preserve">Zammad Knowledge Base → Static Site Backup</w:t>
+      </w:r>
+      <w:r>
+        <w:t xml:space="preserve"> </w:t>
+      </w:r>
+      <w:r>
+        <w:t xml:space="preserve">Self-contained Docker tool that exports a Zammad knowledge base entirely to a directory tree of Markdown files on a schedule, compresses the output, and transfers it off-site — zero manual intervention.</w:t>
+      </w:r>
+      <w:r>
+        <w:t xml:space="preserve"> </w:t>
+      </w:r>
+      <w:hyperlink r:id="rId49">
+        <w:r>
+          <w:rPr>
+            <w:rStyle w:val="Hyperlink"/>
+          </w:rPr>
+          <w:t xml:space="preserve">github.com/MarcusHoltz/zammad-knowledge-base-export-to-static-site</w:t>
+        </w:r>
+      </w:hyperlink>
+    </w:p>
+    <w:p>
+      <w:pPr>
+        <w:pStyle w:val="BodyText"/>
+      </w:pPr>
+      <w:r>
+        <w:rPr>
+          <w:b/>
+        </w:rPr>
+        <w:t xml:space="preserve">Automated Job Search AI Assistant</w:t>
+      </w:r>
+      <w:r>
+        <w:t xml:space="preserve"> </w:t>
+      </w:r>
+      <w:r>
+        <w:t xml:space="preserve">AI-powered agent that autonomously scrapes job listings, scores relevance against a target profile using an LLM, and delivers prioritized alerts — removing the noise from job hunting entirely.</w:t>
+      </w:r>
+      <w:r>
+        <w:t xml:space="preserve"> </w:t>
+      </w:r>
+      <w:hyperlink r:id="rId50">
+        <w:r>
+          <w:rPr>
+            <w:rStyle w:val="Hyperlink"/>
+          </w:rPr>
+          <w:t xml:space="preserve">blog.holtzweb.com</w:t>
+        </w:r>
+      </w:hyperlink>
+    </w:p>
+    <w:p>
+      <w:pPr>
+        <w:pStyle w:val="BodyText"/>
+      </w:pPr>
+      <w:r>
+        <w:rPr>
+          <w:b/>
+        </w:rPr>
+        <w:t xml:space="preserve">Symlink Curator — MusicLink</w:t>
+      </w:r>
+      <w:r>
+        <w:t xml:space="preserve"> </w:t>
+      </w:r>
+      <w:r>
+        <w:t xml:space="preserve">Browser-based tool for managing media collections spread across network shares. Browse shares from a web UI, select files and folders, and it places symlinks into a single output folder with no file duplication. Compatible with Navidrome, Plex, and Jellyfin; runs on UnRAID, TrueNAS, and OpenMediaVault via Docker.</w:t>
+      </w:r>
+      <w:r>
+        <w:t xml:space="preserve"> </w:t>
+      </w:r>
+      <w:hyperlink r:id="rId51">
+        <w:r>
+          <w:rPr>
+            <w:rStyle w:val="Hyperlink"/>
+          </w:rPr>
+          <w:t xml:space="preserve">github.com/MarcusHoltz/musiclink</w:t>
+        </w:r>
+      </w:hyperlink>
+    </w:p>
+    <w:p>
+      <w:pPr>
+        <w:pStyle w:val="BodyText"/>
+      </w:pPr>
+      <w:r>
+        <w:rPr>
+          <w:b/>
+        </w:rPr>
+        <w:t xml:space="preserve">Animated Plymouth Boot Screen Creator</w:t>
+      </w:r>
+      <w:r>
+        <w:t xml:space="preserve"> </w:t>
+      </w:r>
+      <w:r>
+        <w:t xml:space="preserve">Bash pipeline that converts MP4 videos to PNG sequences and packages them as installable custom Plymouth boot themes, automating frame extraction, theme config, and initramfs integration.</w:t>
+      </w:r>
+      <w:r>
+        <w:t xml:space="preserve"> </w:t>
+      </w:r>
+      <w:hyperlink r:id="rId52">
+        <w:r>
+          <w:rPr>
+            <w:rStyle w:val="Hyperlink"/>
+          </w:rPr>
+          <w:t xml:space="preserve">github.com/MarcusHoltz/Animated-Boot-Screen-Creator-for-Linux</w:t>
+        </w:r>
+      </w:hyperlink>
+    </w:p>
+    <w:p>
+      <w:r>
+        <w:pict>
+          <v:rect style="width:0;height:1.5pt" o:hralign="center" o:hrstd="t" o:hr="t"/>
+        </w:pict>
+      </w:r>
+    </w:p>
+    <w:p>
+      <w:pPr>
+        <w:pStyle w:val="Heading2"/>
+      </w:pPr>
+      <w:bookmarkStart w:id="53" w:name="security-infrastructure"/>
+      <w:r>
+        <w:t xml:space="preserve">Security Infrastructure</w:t>
+      </w:r>
+      <w:bookmarkEnd w:id="53"/>
+    </w:p>
+    <w:p>
+      <w:pPr>
+        <w:pStyle w:val="FirstParagraph"/>
+      </w:pPr>
+      <w:r>
+        <w:rPr>
+          <w:b/>
+        </w:rPr>
+        <w:t xml:space="preserve">Authentik SSO with Traefik ForwardAuth</w:t>
+      </w:r>
+      <w:r>
+        <w:t xml:space="preserve"> </w:t>
+      </w:r>
+      <w:r>
+        <w:t xml:space="preserve">Full SSO layer using Authentik on a Docker MacVLAN bridge, enabling Traefik to delegate authentication via ForwardAuth middleware without network collisions. Supports OAuth token exchange across isolated container networks.</w:t>
+      </w:r>
+      <w:r>
+        <w:t xml:space="preserve"> </w:t>
+      </w:r>
+      <w:hyperlink r:id="rId54">
+        <w:r>
+          <w:rPr>
+            <w:rStyle w:val="Hyperlink"/>
+          </w:rPr>
+          <w:t xml:space="preserve">github.com/MarcusHoltz/Authentik-Traefik-MacVLAN</w:t>
+        </w:r>
+      </w:hyperlink>
+    </w:p>
+    <w:p>
+      <w:pPr>
+        <w:pStyle w:val="BodyText"/>
+      </w:pPr>
+      <w:r>
+        <w:rPr>
+          <w:b/>
+        </w:rPr>
+        <w:t xml:space="preserve">Geofiltered IP Blocklist Aggregator</w:t>
+      </w:r>
+      <w:r>
+        <w:t xml:space="preserve"> </w:t>
+      </w:r>
+      <w:r>
+        <w:t xml:space="preserve">Aggregates multiple public threat blocklists into a single optimized firewall-ready list with VLSM compression and country-level geolocation filtering. Runs twice daily via GitHub Actions; compatible with OPNsense, pfSense, iptables, and OpenWRT.</w:t>
+      </w:r>
+      <w:r>
+        <w:t xml:space="preserve"> </w:t>
+      </w:r>
+      <w:hyperlink r:id="rId55">
+        <w:r>
+          <w:rPr>
+            <w:rStyle w:val="Hyperlink"/>
+          </w:rPr>
+          <w:t xml:space="preserve">github.com/MarcusHoltz/ipblocklist-geofiltered-aggregator</w:t>
+        </w:r>
+      </w:hyperlink>
+    </w:p>
+    <w:p>
+      <w:pPr>
+        <w:pStyle w:val="BodyText"/>
+      </w:pPr>
+      <w:r>
+        <w:rPr>
+          <w:b/>
+        </w:rPr>
+        <w:t xml:space="preserve">VPN over Port 53</w:t>
+      </w:r>
+      <w:r>
+        <w:t xml:space="preserve"> </w:t>
+      </w:r>
+      <w:r>
+        <w:t xml:space="preserve">WireGuard VPN tunneled through port 53, with iodine DNS tunnel as fallback and CrowdSec as a behavioral DNS firewall. Bypasses carrier-level VPN blocking — nftables routes traffic, CrowdSec bans probers at the kernel level.</w:t>
+      </w:r>
+      <w:r>
+        <w:t xml:space="preserve"> </w:t>
+      </w:r>
+      <w:hyperlink r:id="rId56">
+        <w:r>
+          <w:rPr>
+            <w:rStyle w:val="Hyperlink"/>
+          </w:rPr>
+          <w:t xml:space="preserve">github.com/MarcusHoltz/vpn-over-port-53</w:t>
+        </w:r>
+      </w:hyperlink>
+    </w:p>
+    <w:p>
+      <w:pPr>
+        <w:pStyle w:val="BodyText"/>
+      </w:pPr>
+      <w:r>
+        <w:rPr>
+          <w:b/>
+        </w:rPr>
+        <w:t xml:space="preserve">Unique Stateless Password Derivation Script</w:t>
+      </w:r>
+      <w:r>
+        <w:t xml:space="preserve"> </w:t>
+      </w:r>
+      <w:r>
+        <w:t xml:space="preserve">Generates repeatable, unique passwords for every service from a single master secret — no password manager required. Deterministic hashing means you can always reproduce the same credential without storing it anywhere.</w:t>
+      </w:r>
+      <w:r>
+        <w:t xml:space="preserve"> </w:t>
+      </w:r>
+      <w:hyperlink r:id="rId57">
+        <w:r>
+          <w:rPr>
+            <w:rStyle w:val="Hyperlink"/>
+          </w:rPr>
+          <w:t xml:space="preserve">github.com/MarcusHoltz/password-hash-script</w:t>
+        </w:r>
+      </w:hyperlink>
+    </w:p>
+    <w:p>
+      <w:pPr>
+        <w:pStyle w:val="BodyText"/>
+      </w:pPr>
+      <w:r>
+        <w:rPr>
+          <w:b/>
+        </w:rPr>
+        <w:t xml:space="preserve">Hidden VPN Disguised as a Website</w:t>
+      </w:r>
+      <w:r>
+        <w:t xml:space="preserve"> </w:t>
+      </w:r>
+      <w:r>
+        <w:t xml:space="preserve">Docker setup deploying an HTTPS proxy disguised as a legitimate tech-company landing page. XRAY VLESS over WebSocket/TLS routes traffic through a convincing decoy site — six industry presets, browser-based terminal via ttyd, zero-SSH management.</w:t>
+      </w:r>
+      <w:r>
+        <w:t xml:space="preserve"> </w:t>
+      </w:r>
+      <w:hyperlink r:id="rId58">
+        <w:r>
+          <w:rPr>
+            <w:rStyle w:val="Hyperlink"/>
+          </w:rPr>
+          <w:t xml:space="preserve">github.com/MarcusHoltz/hidden-vpn-that-looks-like-a-website</w:t>
+        </w:r>
+      </w:hyperlink>
+    </w:p>
+    <w:p>
+      <w:pPr>
+        <w:pStyle w:val="BodyText"/>
+      </w:pPr>
+      <w:r>
+        <w:rPr>
+          <w:b/>
+        </w:rPr>
+        <w:t xml:space="preserve">Piping Server — Ephemeral Secure Sharing</w:t>
+      </w:r>
+      <w:r>
+        <w:t xml:space="preserve"> </w:t>
+      </w:r>
+      <w:r>
+        <w:t xml:space="preserve">Self-hosted one-time-use encrypted data channels over plain HTTP. Used for secure file transfers, encrypted chat, and remote command execution — no special client software needed.</w:t>
+      </w:r>
+      <w:r>
+        <w:t xml:space="preserve"> </w:t>
+      </w:r>
+      <w:hyperlink r:id="rId59">
+        <w:r>
+          <w:rPr>
+            <w:rStyle w:val="Hyperlink"/>
+          </w:rPr>
+          <w:t xml:space="preserve">blog.holtzweb.com</w:t>
+        </w:r>
+      </w:hyperlink>
+    </w:p>
+    <w:p>
+      <w:pPr>
+        <w:pStyle w:val="BodyText"/>
+      </w:pPr>
+      <w:r>
+        <w:rPr>
+          <w:b/>
+        </w:rPr>
+        <w:t xml:space="preserve">Tor Hidden Service with Vanity .onion Address</w:t>
+      </w:r>
+      <w:r>
+        <w:t xml:space="preserve"> </w:t>
+      </w:r>
+      <w:r>
+        <w:t xml:space="preserve">Automated Docker deployment for Tor hidden services with mkp224o vanity address generation and X25519 client authorization — no open ports required.</w:t>
+      </w:r>
+      <w:r>
+        <w:t xml:space="preserve"> </w:t>
+      </w:r>
+      <w:hyperlink r:id="rId60">
+        <w:r>
+          <w:rPr>
+            <w:rStyle w:val="Hyperlink"/>
+          </w:rPr>
+          <w:t xml:space="preserve">github.com/MarcusHoltz/tor-hidden-service</w:t>
+        </w:r>
+      </w:hyperlink>
+    </w:p>
+    <w:p>
+      <w:pPr>
+        <w:pStyle w:val="BodyText"/>
+      </w:pPr>
+      <w:r>
+        <w:rPr>
+          <w:b/>
+        </w:rPr>
+        <w:t xml:space="preserve">Transparent Nginx WAF on OPNsense</w:t>
+      </w:r>
+      <w:r>
+        <w:t xml:space="preserve"> </w:t>
+      </w:r>
+      <w:r>
+        <w:t xml:space="preserve">Transparent Web Application Firewall using Nginx on OPNsense with Caddy and Traefik failover — layer-7 inspection and active threat blocking for self-hosted services, with zero changes required at the application layer.</w:t>
+      </w:r>
+      <w:r>
+        <w:t xml:space="preserve"> </w:t>
+      </w:r>
+      <w:hyperlink r:id="rId61">
+        <w:r>
+          <w:rPr>
+            <w:rStyle w:val="Hyperlink"/>
+          </w:rPr>
+          <w:t xml:space="preserve">blog.holtzweb.com</w:t>
+        </w:r>
+      </w:hyperlink>
+    </w:p>
+    <w:p>
+      <w:pPr>
+        <w:pStyle w:val="BodyText"/>
+      </w:pPr>
+      <w:r>
+        <w:rPr>
+          <w:b/>
+        </w:rPr>
+        <w:t xml:space="preserve">nzyme Wireless Security Monitoring</w:t>
+      </w:r>
+      <w:r>
+        <w:t xml:space="preserve"> </w:t>
+      </w:r>
+      <w:r>
+        <w:t xml:space="preserve">Deploys nzyme — a Java-based WiFi threat detection system using libpcap packet capture — to identify and physically locate rogue access points and wireless attacks, backed by a PostgreSQL database and web dashboards.</w:t>
+      </w:r>
+      <w:r>
+        <w:t xml:space="preserve"> </w:t>
+      </w:r>
+      <w:hyperlink r:id="rId62">
+        <w:r>
+          <w:rPr>
+            <w:rStyle w:val="Hyperlink"/>
+          </w:rPr>
+          <w:t xml:space="preserve">github.com/MarcusHoltz/nzyme-install-wizard</w:t>
+        </w:r>
+      </w:hyperlink>
+    </w:p>
+    <w:p>
+      <w:pPr>
+        <w:pStyle w:val="BodyText"/>
+      </w:pPr>
+      <w:r>
+        <w:rPr>
+          <w:b/>
+        </w:rPr>
+        <w:t xml:space="preserve">DNS Image Transfer</w:t>
+      </w:r>
+      <w:r>
+        <w:t xml:space="preserve"> </w:t>
+      </w:r>
+      <w:r>
+        <w:t xml:space="preserve">Encodes images in Base64, splits them across Cloudflare DNS TXT records, and stores the retrieval script in DNS itself. Download and reconstruct the image anywhere with only</w:t>
+      </w:r>
+      <w:r>
+        <w:t xml:space="preserve"> </w:t>
+      </w:r>
+      <w:r>
+        <w:rPr>
+          <w:rStyle w:val="VerbatimChar"/>
+        </w:rPr>
+        <w:t xml:space="preserve">dig</w:t>
+      </w:r>
+      <w:r>
+        <w:t xml:space="preserve"> </w:t>
+      </w:r>
+      <w:r>
+        <w:t xml:space="preserve">— no server, no HTTP.</w:t>
+      </w:r>
+      <w:r>
+        <w:t xml:space="preserve"> </w:t>
+      </w:r>
+      <w:hyperlink r:id="rId63">
+        <w:r>
+          <w:rPr>
+            <w:rStyle w:val="Hyperlink"/>
+          </w:rPr>
+          <w:t xml:space="preserve">github.com/MarcusHoltz/DNS-photo-download</w:t>
+        </w:r>
+      </w:hyperlink>
+    </w:p>
+    <w:p>
+      <w:pPr>
+        <w:pStyle w:val="BodyText"/>
+      </w:pPr>
+      <w:r>
+        <w:rPr>
+          <w:b/>
+        </w:rPr>
+        <w:t xml:space="preserve">WAF Smoke Test Script</w:t>
+      </w:r>
+      <w:r>
+        <w:t xml:space="preserve"> </w:t>
+      </w:r>
+      <w:r>
+        <w:t xml:space="preserve">Lightweight shell script that tests WAF effectiveness by firing a battery of attack patterns — SQLi, XSS, path traversal, and more — to verify blocking rules are actually working against OWASP Top 10 vectors.</w:t>
+      </w:r>
+      <w:r>
+        <w:t xml:space="preserve"> </w:t>
+      </w:r>
+      <w:hyperlink r:id="rId64">
+        <w:r>
+          <w:rPr>
+            <w:rStyle w:val="Hyperlink"/>
+          </w:rPr>
+          <w:t xml:space="preserve">github.com/MarcusHoltz/waf-smoke-test.sh</w:t>
+        </w:r>
+      </w:hyperlink>
+    </w:p>
+    <w:p>
+      <w:pPr>
+        <w:pStyle w:val="BodyText"/>
+      </w:pPr>
+      <w:r>
+        <w:rPr>
+          <w:b/>
+        </w:rPr>
+        <w:t xml:space="preserve">Docker Service Phone-Home Audit</w:t>
+      </w:r>
+      <w:r>
+        <w:t xml:space="preserve"> </w:t>
+      </w:r>
+      <w:r>
+        <w:t xml:space="preserve">Network audit tool that captures every outbound connection made by a Docker service, geolocates each IP, and delivers a PASS/FAIL verdict for phone-home behavior. Tests services in sealed Docker-in-Docker environments with Wireshark-compatible PCAP output.</w:t>
+      </w:r>
+      <w:r>
+        <w:t xml:space="preserve"> </w:t>
+      </w:r>
+      <w:hyperlink r:id="rId65">
+        <w:r>
+          <w:rPr>
+            <w:rStyle w:val="Hyperlink"/>
+          </w:rPr>
+          <w:t xml:space="preserve">github.com/MarcusHoltz/docker-service-phone-home-audit</w:t>
+        </w:r>
+      </w:hyperlink>
+    </w:p>
+    <w:p>
+      <w:r>
+        <w:pict>
+          <v:rect style="width:0;height:1.5pt" o:hralign="center" o:hrstd="t" o:hr="t"/>
+        </w:pict>
+      </w:r>
+    </w:p>
+    <w:p>
+      <w:pPr>
+        <w:pStyle w:val="Heading2"/>
+      </w:pPr>
+      <w:bookmarkStart w:id="66" w:name="network-engineering"/>
+      <w:r>
+        <w:t xml:space="preserve">Network Engineering</w:t>
+      </w:r>
+      <w:bookmarkEnd w:id="66"/>
+    </w:p>
+    <w:p>
+      <w:pPr>
+        <w:pStyle w:val="FirstParagraph"/>
+      </w:pPr>
+      <w:r>
+        <w:rPr>
+          <w:b/>
+        </w:rPr>
+        <w:t xml:space="preserve">After-Hours Network Lockdown</w:t>
+      </w:r>
+      <w:r>
+        <w:t xml:space="preserve"> </w:t>
+      </w:r>
+      <w:r>
+        <w:t xml:space="preserve">Automated network curfew: OpenWRT kills the WiFi radio, OPNsense VLAN firewall rules lock down traffic, and Authentik policies block application logins — all on a schedule. Includes daily SSID rotation with the password hidden inside a math puzzle.</w:t>
+      </w:r>
+      <w:r>
+        <w:t xml:space="preserve"> </w:t>
+      </w:r>
+      <w:hyperlink r:id="rId67">
+        <w:r>
+          <w:rPr>
+            <w:rStyle w:val="Hyperlink"/>
+          </w:rPr>
+          <w:t xml:space="preserve">blog.holtzweb.com</w:t>
+        </w:r>
+      </w:hyperlink>
+    </w:p>
+    <w:p>
+      <w:pPr>
+        <w:pStyle w:val="BodyText"/>
+      </w:pPr>
+      <w:r>
+        <w:rPr>
+          <w:b/>
+        </w:rPr>
+        <w:t xml:space="preserve">OPNsense Multi-Site HAProxy + Unbound</w:t>
+      </w:r>
+      <w:r>
+        <w:t xml:space="preserve"> </w:t>
+      </w:r>
+      <w:r>
+        <w:t xml:space="preserve">Layer-7 traffic routing across multiple domains through a single OPNsense box — HAProxy for domain-based splitting, Unbound for split-DNS, DNSCrypt for encrypted upstream resolution, and WireGuard for secure remote access.</w:t>
+      </w:r>
+      <w:r>
+        <w:t xml:space="preserve"> </w:t>
+      </w:r>
+      <w:hyperlink r:id="rId68">
+        <w:r>
+          <w:rPr>
+            <w:rStyle w:val="Hyperlink"/>
+          </w:rPr>
+          <w:t xml:space="preserve">blog.holtzweb.com</w:t>
+        </w:r>
+      </w:hyperlink>
+    </w:p>
+    <w:p>
+      <w:pPr>
+        <w:pStyle w:val="BodyText"/>
+      </w:pPr>
+      <w:r>
+        <w:rPr>
+          <w:b/>
+        </w:rPr>
+        <w:t xml:space="preserve">OPNsense WireGuard Site-to-Site VPN</w:t>
+      </w:r>
+      <w:r>
+        <w:t xml:space="preserve"> </w:t>
+      </w:r>
+      <w:r>
+        <w:t xml:space="preserve">Full WireGuard VPN deployment on OPNsense for site-to-site tunnels and remote access — cryptographic key routing, firewall rules, DNSSEC-validating Unbound, and multi-site subnet routing.</w:t>
+      </w:r>
+      <w:r>
+        <w:t xml:space="preserve"> </w:t>
+      </w:r>
+      <w:hyperlink r:id="rId69">
+        <w:r>
+          <w:rPr>
+            <w:rStyle w:val="Hyperlink"/>
+          </w:rPr>
+          <w:t xml:space="preserve">blog.holtzweb.com</w:t>
+        </w:r>
+      </w:hyperlink>
+    </w:p>
+    <w:p>
+      <w:pPr>
+        <w:pStyle w:val="BodyText"/>
+      </w:pPr>
+      <w:r>
+        <w:rPr>
+          <w:b/>
+        </w:rPr>
+        <w:t xml:space="preserve">HAProxy Proxy Protocol to Traefik</w:t>
+      </w:r>
+      <w:r>
+        <w:t xml:space="preserve"> </w:t>
+      </w:r>
+      <w:r>
+        <w:t xml:space="preserve">Configures HAProxy on OPNsense to forward real client IPs through multiple proxy layers to Traefik using Proxy Protocol v2 — domain-based routing with full client metadata preserved end-to-end for accurate logging and rate limiting.</w:t>
+      </w:r>
+      <w:r>
+        <w:t xml:space="preserve"> </w:t>
+      </w:r>
+      <w:hyperlink r:id="rId70">
+        <w:r>
+          <w:rPr>
+            <w:rStyle w:val="Hyperlink"/>
+          </w:rPr>
+          <w:t xml:space="preserve">blog.holtzweb.com</w:t>
+        </w:r>
+      </w:hyperlink>
+    </w:p>
+    <w:p>
+      <w:pPr>
+        <w:pStyle w:val="BodyText"/>
+      </w:pPr>
+      <w:r>
+        <w:rPr>
+          <w:b/>
+        </w:rPr>
+        <w:t xml:space="preserve">PowerDNS + Unbound DNS Infrastructure</w:t>
+      </w:r>
+      <w:r>
+        <w:t xml:space="preserve"> </w:t>
+      </w:r>
+      <w:r>
+        <w:t xml:space="preserve">Authoritative (PowerDNS with web GUI) and recursive (Unbound with DNSSEC validation) DNS stack — fully self-hosted, no upstream provider dependency for internal zone resolution.</w:t>
+      </w:r>
+      <w:r>
+        <w:t xml:space="preserve"> </w:t>
+      </w:r>
+      <w:hyperlink r:id="rId71">
+        <w:r>
+          <w:rPr>
+            <w:rStyle w:val="Hyperlink"/>
+          </w:rPr>
+          <w:t xml:space="preserve">blog.holtzweb.com</w:t>
+        </w:r>
+      </w:hyperlink>
+    </w:p>
+    <w:p>
+      <w:r>
+        <w:pict>
+          <v:rect style="width:0;height:1.5pt" o:hralign="center" o:hrstd="t" o:hr="t"/>
+        </w:pict>
+      </w:r>
+    </w:p>
+    <w:p>
+      <w:pPr>
+        <w:pStyle w:val="Heading2"/>
+      </w:pPr>
+      <w:bookmarkStart w:id="72" w:name="monitoring-observability"/>
+      <w:r>
+        <w:t xml:space="preserve">Monitoring &amp; Observability</w:t>
+      </w:r>
+      <w:bookmarkEnd w:id="72"/>
+    </w:p>
+    <w:p>
+      <w:pPr>
+        <w:pStyle w:val="FirstParagraph"/>
+      </w:pPr>
+      <w:r>
+        <w:rPr>
+          <w:b/>
+        </w:rPr>
+        <w:t xml:space="preserve">Grafana + Alloy + Loki Observability Stack</w:t>
+      </w:r>
+      <w:r>
+        <w:t xml:space="preserve"> </w:t>
+      </w:r>
+      <w:r>
+        <w:t xml:space="preserve">Containerized full-stack observability: Grafana dashboards, Loki log aggregation, and Grafana Alloy as the OpenTelemetry-compatible collector — Docker Compose deployed with persistent storage and alerting rules.</w:t>
+      </w:r>
+      <w:r>
+        <w:t xml:space="preserve"> </w:t>
+      </w:r>
+      <w:hyperlink r:id="rId73">
+        <w:r>
+          <w:rPr>
+            <w:rStyle w:val="Hyperlink"/>
+          </w:rPr>
+          <w:t xml:space="preserve">github.com/MarcusHoltz/grafana-loki-alloy-homelab-monitoring-stack</w:t>
+        </w:r>
+      </w:hyperlink>
+    </w:p>
+    <w:p>
+      <w:pPr>
+        <w:pStyle w:val="BodyText"/>
+      </w:pPr>
+      <w:r>
+        <w:rPr>
+          <w:b/>
+        </w:rPr>
+        <w:t xml:space="preserve">Docker MacVLAN Traefik Analytics</w:t>
+      </w:r>
+      <w:r>
+        <w:t xml:space="preserve"> </w:t>
+      </w:r>
+      <w:r>
+        <w:t xml:space="preserve">Traefik deployed on a MacVLAN interface for direct physical network access, feeding un-NAT’d access logs through Promtail → Loki → Grafana for accurate per-client analytics without exposing the host network.</w:t>
+      </w:r>
+      <w:r>
+        <w:t xml:space="preserve"> </w:t>
+      </w:r>
+      <w:hyperlink r:id="rId74">
+        <w:r>
+          <w:rPr>
+            <w:rStyle w:val="Hyperlink"/>
+          </w:rPr>
+          <w:t xml:space="preserve">github.com/MarcusHoltz/Traefik-MacVLAN</w:t>
+        </w:r>
+      </w:hyperlink>
+    </w:p>
+    <w:p>
+      <w:r>
+        <w:pict>
+          <v:rect style="width:0;height:1.5pt" o:hralign="center" o:hrstd="t" o:hr="t"/>
+        </w:pict>
+      </w:r>
+    </w:p>
+    <w:p>
+      <w:pPr>
+        <w:pStyle w:val="Heading2"/>
+      </w:pPr>
+      <w:bookmarkStart w:id="75" w:name="homelab-infrastructure"/>
+      <w:r>
+        <w:t xml:space="preserve">Homelab &amp; Infrastructure</w:t>
+      </w:r>
+      <w:bookmarkEnd w:id="75"/>
+    </w:p>
+    <w:p>
+      <w:pPr>
+        <w:pStyle w:val="FirstParagraph"/>
+      </w:pPr>
+      <w:r>
+        <w:rPr>
+          <w:b/>
+        </w:rPr>
+        <w:t xml:space="preserve">Proxmox Disaster Recovery System</w:t>
+      </w:r>
+      <w:r>
+        <w:t xml:space="preserve"> </w:t>
+      </w:r>
+      <w:r>
+        <w:t xml:space="preserve">Enterprise-grade automated backup and disaster recovery for Proxmox clusters: ZFS snapshots managed by Sanoid, VM-level backups via cv4pve, and off-site incremental replication to Proxmox Backup Server 2 — fully hands-off with quarterly restore validation.</w:t>
+      </w:r>
+      <w:r>
+        <w:t xml:space="preserve"> </w:t>
+      </w:r>
+      <w:hyperlink r:id="rId76">
+        <w:r>
+          <w:rPr>
+            <w:rStyle w:val="Hyperlink"/>
+          </w:rPr>
+          <w:t xml:space="preserve">github.com/MarcusHoltz/proxmox-automatic-backups</w:t>
+        </w:r>
+      </w:hyperlink>
+    </w:p>
+    <w:p>
+      <w:pPr>
+        <w:pStyle w:val="BodyText"/>
+      </w:pPr>
+      <w:r>
+        <w:rPr>
+          <w:b/>
+        </w:rPr>
+        <w:t xml:space="preserve">ZFS Storage &amp; Snapshot Architecture</w:t>
+      </w:r>
+      <w:r>
+        <w:t xml:space="preserve"> </w:t>
+      </w:r>
+      <w:r>
+        <w:t xml:space="preserve">Optimal ZFS datastore design for Proxmox — pool layout, compression, deduplication, snapshot scheduling, and cluster-friendly dataset naming conventions that survive live migrations without I/O storms.</w:t>
+      </w:r>
+      <w:r>
+        <w:t xml:space="preserve"> </w:t>
+      </w:r>
+      <w:hyperlink r:id="rId77">
+        <w:r>
+          <w:rPr>
+            <w:rStyle w:val="Hyperlink"/>
+          </w:rPr>
+          <w:t xml:space="preserve">blog.holtzweb.com</w:t>
+        </w:r>
+      </w:hyperlink>
+    </w:p>
+    <w:p>
+      <w:pPr>
+        <w:pStyle w:val="BodyText"/>
+      </w:pPr>
+      <w:r>
+        <w:rPr>
+          <w:b/>
+        </w:rPr>
+        <w:t xml:space="preserve">Reticulum Mesh Network Demo</w:t>
+      </w:r>
+      <w:r>
+        <w:t xml:space="preserve"> </w:t>
+      </w:r>
+      <w:r>
+        <w:t xml:space="preserve">Self-contained Docker demo for Reticulum — a cryptographic mesh networking stack where every address is the hash of a public key. Runs encrypted shells, file transfers, and LoRa mesh radio demonstrations from a browser-based terminal.</w:t>
+      </w:r>
+      <w:r>
+        <w:t xml:space="preserve"> </w:t>
+      </w:r>
+      <w:hyperlink r:id="rId78">
+        <w:r>
+          <w:rPr>
+            <w:rStyle w:val="Hyperlink"/>
+          </w:rPr>
+          <w:t xml:space="preserve">github.com/MarcusHoltz/reticulum-demo</w:t>
+        </w:r>
+      </w:hyperlink>
+    </w:p>
+    <w:p>
+      <w:pPr>
+        <w:pStyle w:val="BodyText"/>
+      </w:pPr>
+      <w:r>
+        <w:rPr>
+          <w:b/>
+        </w:rPr>
+        <w:t xml:space="preserve">Immich Self-Hosted Photo Platform</w:t>
+      </w:r>
+      <w:r>
+        <w:t xml:space="preserve"> </w:t>
+      </w:r>
+      <w:r>
+        <w:t xml:space="preserve">Complete Immich deployment on UnRAID with Docker — self-hosted Google Photos replacement with ML-powered photo analysis, duplicate detection, multi-user support, video compression, and NetBird VPN for remote access.</w:t>
+      </w:r>
+      <w:r>
+        <w:t xml:space="preserve"> </w:t>
+      </w:r>
+      <w:hyperlink r:id="rId79">
+        <w:r>
+          <w:rPr>
+            <w:rStyle w:val="Hyperlink"/>
+          </w:rPr>
+          <w:t xml:space="preserve">github.com/MarcusHoltz/immich-setup</w:t>
+        </w:r>
+      </w:hyperlink>
+    </w:p>
+    <w:p>
+      <w:pPr>
+        <w:pStyle w:val="BodyText"/>
+      </w:pPr>
+      <w:r>
+        <w:rPr>
+          <w:b/>
+        </w:rPr>
+        <w:t xml:space="preserve">Cloudflare Email Routing &amp; Aliasing</w:t>
+      </w:r>
+      <w:r>
+        <w:t xml:space="preserve"> </w:t>
+      </w:r>
+      <w:r>
+        <w:t xml:space="preserve">Privacy-first infinite unique inbound email alias system using Cloudflare Email Routing — all addresses route to a single private mailbox with no third-party dependency and no PII exposed to senders.</w:t>
+      </w:r>
+      <w:r>
+        <w:t xml:space="preserve"> </w:t>
+      </w:r>
+      <w:hyperlink r:id="rId80">
+        <w:r>
+          <w:rPr>
+            <w:rStyle w:val="Hyperlink"/>
+          </w:rPr>
+          <w:t xml:space="preserve">blog.holtzweb.com</w:t>
+        </w:r>
+      </w:hyperlink>
+    </w:p>
+    <w:p>
+      <w:r>
+        <w:pict>
+          <v:rect style="width:0;height:1.5pt" o:hralign="center" o:hrstd="t" o:hr="t"/>
+        </w:pict>
+      </w:r>
+    </w:p>
+    <w:p>
+      <w:pPr>
+        <w:pStyle w:val="Heading2"/>
+      </w:pPr>
+      <w:bookmarkStart w:id="81" w:name="web-development"/>
       <w:r>
         <w:t xml:space="preserve">Web Development</w:t>
       </w:r>
-      <w:bookmarkEnd w:id="39"/>
+      <w:bookmarkEnd w:id="81"/>
+    </w:p>
+    <w:p>
+      <w:pPr>
+        <w:pStyle w:val="FirstParagraph"/>
+      </w:pPr>
+      <w:r>
+        <w:rPr>
+          <w:b/>
+        </w:rPr>
+        <w:t xml:space="preserve">Astro Portfolio Site</w:t>
+      </w:r>
+      <w:r>
+        <w:t xml:space="preserve"> </w:t>
+      </w:r>
+      <w:r>
+        <w:rPr>
+          <w:i/>
+        </w:rPr>
+        <w:t xml:space="preserve">(marcusholtz.com)</w:t>
+      </w:r>
+      <w:r>
+        <w:t xml:space="preserve"> </w:t>
+      </w:r>
+      <w:r>
+        <w:t xml:space="preserve">This portfolio, built on Astro with TypeScript and Tailwind CSS. Content driven by JSON files — multi-stage Docker CI with automatic one-command deploy to GitHub Pages, GitLab, Cloudflare, or a self-hosted VPS.</w:t>
+      </w:r>
+      <w:r>
+        <w:t xml:space="preserve"> </w:t>
+      </w:r>
+      <w:hyperlink r:id="rId82">
+        <w:r>
+          <w:rPr>
+            <w:rStyle w:val="Hyperlink"/>
+          </w:rPr>
+          <w:t xml:space="preserve">github.com/MarcusHoltz/astro-portfolio-theme</w:t>
+        </w:r>
+      </w:hyperlink>
+    </w:p>
+    <w:p>
+      <w:pPr>
+        <w:pStyle w:val="BodyText"/>
+      </w:pPr>
+      <w:r>
+        <w:rPr>
+          <w:b/>
+        </w:rPr>
+        <w:t xml:space="preserve">Astro Marketing Theme</w:t>
+      </w:r>
+      <w:r>
+        <w:t xml:space="preserve"> </w:t>
+      </w:r>
+      <w:r>
+        <w:t xml:space="preserve">Astro 6 + Tailwind CSS 4 marketing site template with persistent sidebar navigation, nested dropdowns, RSS blog importer, portfolio slider, Web3Forms contact integration, and a simulated chat widget. All content lives in JSON files.</w:t>
+      </w:r>
+      <w:r>
+        <w:t xml:space="preserve"> </w:t>
+      </w:r>
+      <w:hyperlink r:id="rId83">
+        <w:r>
+          <w:rPr>
+            <w:rStyle w:val="Hyperlink"/>
+          </w:rPr>
+          <w:t xml:space="preserve">github.com/MarcusHoltz/astro-marketing-theme</w:t>
+        </w:r>
+      </w:hyperlink>
+    </w:p>
+    <w:p>
+      <w:pPr>
+        <w:pStyle w:val="BodyText"/>
+      </w:pPr>
+      <w:r>
+        <w:rPr>
+          <w:b/>
+        </w:rPr>
+        <w:t xml:space="preserve">Chrome/Firefox Extension — Zammad Time Tracker</w:t>
+      </w:r>
+      <w:r>
+        <w:t xml:space="preserve"> </w:t>
+      </w:r>
+      <w:r>
+        <w:t xml:space="preserve">Browser extension for Chrome and Firefox that surfaces Zammad helpdesk ticket time tracking directly in the toolbar, eliminating context-switching when logging billable hours.</w:t>
+      </w:r>
+      <w:r>
+        <w:t xml:space="preserve"> </w:t>
+      </w:r>
+      <w:hyperlink r:id="rId84">
+        <w:r>
+          <w:rPr>
+            <w:rStyle w:val="Hyperlink"/>
+          </w:rPr>
+          <w:t xml:space="preserve">github.com/MarcusHoltz/zammad-time-tracker-browser-extensions</w:t>
+        </w:r>
+      </w:hyperlink>
+    </w:p>
+    <w:p>
+      <w:pPr>
+        <w:pStyle w:val="BodyText"/>
+      </w:pPr>
+      <w:r>
+        <w:rPr>
+          <w:b/>
+        </w:rPr>
+        <w:t xml:space="preserve">WheelSpin — Self-Hosted Random Selector</w:t>
+      </w:r>
+      <w:r>
+        <w:t xml:space="preserve"> </w:t>
+      </w:r>
+      <w:r>
+        <w:t xml:space="preserve">Self-hosted spinning wheel web application for randomly selecting outcomes, with fully configurable entry lists and Docker deployment.</w:t>
+      </w:r>
+      <w:r>
+        <w:t xml:space="preserve"> </w:t>
+      </w:r>
+      <w:hyperlink r:id="rId85">
+        <w:r>
+          <w:rPr>
+            <w:rStyle w:val="Hyperlink"/>
+          </w:rPr>
+          <w:t xml:space="preserve">github.com/MarcusHoltz/wheelspin</w:t>
+        </w:r>
+      </w:hyperlink>
+    </w:p>
+    <w:p>
+      <w:pPr>
+        <w:pStyle w:val="BodyText"/>
+      </w:pPr>
+      <w:r>
+        <w:rPr>
+          <w:b/>
+        </w:rPr>
+        <w:t xml:space="preserve">Self-Hosted Interactive Map</w:t>
+      </w:r>
+      <w:r>
+        <w:t xml:space="preserve"> </w:t>
+      </w:r>
+      <w:r>
+        <w:t xml:space="preserve">Web application for drawing and labeling geographic areas with persistent storage — used for network topology and infrastructure diagrams with no cloud dependency.</w:t>
+      </w:r>
+      <w:r>
+        <w:t xml:space="preserve"> </w:t>
+      </w:r>
+      <w:hyperlink r:id="rId86">
+        <w:r>
+          <w:rPr>
+            <w:rStyle w:val="Hyperlink"/>
+          </w:rPr>
+          <w:t xml:space="preserve">github.com/MarcusHoltz/map-layers</w:t>
+        </w:r>
+      </w:hyperlink>
+    </w:p>
+    <w:p>
+      <w:r>
+        <w:pict>
+          <v:rect style="width:0;height:1.5pt" o:hralign="center" o:hrstd="t" o:hr="t"/>
+        </w:pict>
+      </w:r>
+    </w:p>
+    <w:p>
+      <w:pPr>
+        <w:pStyle w:val="Heading2"/>
+      </w:pPr>
+      <w:bookmarkStart w:id="87" w:name="client-work-holtzweb"/>
+      <w:r>
+        <w:t xml:space="preserve">Client Work (Holtzweb)</w:t>
+      </w:r>
+      <w:bookmarkEnd w:id="87"/>
+    </w:p>
+    <w:p>
+      <w:pPr>
+        <w:pStyle w:val="FirstParagraph"/>
+      </w:pPr>
+      <w:r>
+        <w:rPr>
+          <w:b/>
+        </w:rPr>
+        <w:t xml:space="preserve">Clearwave</w:t>
+      </w:r>
+      <w:r>
+        <w:t xml:space="preserve"> </w:t>
+      </w:r>
+      <w:r>
+        <w:rPr>
+          <w:i/>
+        </w:rPr>
+        <w:t xml:space="preserve">(Technology)</w:t>
+      </w:r>
+      <w:r>
+        <w:t xml:space="preserve"> </w:t>
+      </w:r>
+      <w:r>
+        <w:t xml:space="preserve">— Full frontend redesign and custom backend development for a technology sector client; clean architecture, fast load times, and conversion-focused layout.</w:t>
+      </w:r>
+    </w:p>
+    <w:p>
+      <w:pPr>
+        <w:pStyle w:val="BodyText"/>
+      </w:pPr>
+      <w:r>
+        <w:rPr>
+          <w:b/>
+        </w:rPr>
+        <w:t xml:space="preserve">Roberts Law</w:t>
+      </w:r>
+      <w:r>
+        <w:t xml:space="preserve"> </w:t>
+      </w:r>
+      <w:r>
+        <w:rPr>
+          <w:i/>
+        </w:rPr>
+        <w:t xml:space="preserve">(Legal)</w:t>
+      </w:r>
+      <w:r>
+        <w:t xml:space="preserve"> </w:t>
+      </w:r>
+      <w:r>
+        <w:t xml:space="preserve">— Law firm site rebuilt for organic search performance with SEO-optimized information architecture; measurably increased organic traffic.</w:t>
+      </w:r>
+    </w:p>
+    <w:p>
+      <w:pPr>
+        <w:pStyle w:val="BodyText"/>
+      </w:pPr>
+      <w:r>
+        <w:rPr>
+          <w:b/>
+        </w:rPr>
+        <w:t xml:space="preserve">City of Carterville</w:t>
+      </w:r>
+      <w:r>
+        <w:t xml:space="preserve"> </w:t>
+      </w:r>
+      <w:r>
+        <w:rPr>
+          <w:i/>
+        </w:rPr>
+        <w:t xml:space="preserve">(Municipalities)</w:t>
+      </w:r>
+      <w:r>
+        <w:t xml:space="preserve"> </w:t>
+      </w:r>
+      <w:r>
+        <w:t xml:space="preserve">— Full municipal government website with ADA-compliant, mobile-first resident services portal and content management system.</w:t>
+      </w:r>
+    </w:p>
+    <w:p>
+      <w:pPr>
+        <w:pStyle w:val="BodyText"/>
+      </w:pPr>
+      <w:r>
+        <w:rPr>
+          <w:b/>
+        </w:rPr>
+        <w:t xml:space="preserve">Carterville Parks &amp; Recreation</w:t>
+      </w:r>
+      <w:r>
+        <w:t xml:space="preserve"> </w:t>
+      </w:r>
+      <w:r>
+        <w:rPr>
+          <w:i/>
+        </w:rPr>
+        <w:t xml:space="preserve">(Municipalities)</w:t>
+      </w:r>
+      <w:r>
+        <w:t xml:space="preserve"> </w:t>
+      </w:r>
+      <w:r>
+        <w:t xml:space="preserve">— Parks department site with aquatics schedules, adult recreation program listings, and responsive layout.</w:t>
+      </w:r>
+    </w:p>
+    <w:p>
+      <w:pPr>
+        <w:pStyle w:val="BodyText"/>
+      </w:pPr>
+      <w:r>
+        <w:rPr>
+          <w:b/>
+        </w:rPr>
+        <w:t xml:space="preserve">Eclipse Tourism</w:t>
+      </w:r>
+      <w:r>
+        <w:t xml:space="preserve"> </w:t>
+      </w:r>
+      <w:r>
+        <w:rPr>
+          <w:i/>
+        </w:rPr>
+        <w:t xml:space="preserve">(Tourism)</w:t>
+      </w:r>
+      <w:r>
+        <w:t xml:space="preserve"> </w:t>
+      </w:r>
+      <w:r>
+        <w:t xml:space="preserve">— Interactive JavaScript event map with filterable overlays, built for high traffic during a regional solar eclipse campaign.</w:t>
+      </w:r>
+    </w:p>
+    <w:p>
+      <w:pPr>
+        <w:pStyle w:val="BodyText"/>
+      </w:pPr>
+      <w:r>
+        <w:rPr>
+          <w:b/>
+        </w:rPr>
+        <w:t xml:space="preserve">Giant City Lodge</w:t>
+      </w:r>
+      <w:r>
+        <w:t xml:space="preserve"> </w:t>
+      </w:r>
+      <w:r>
+        <w:rPr>
+          <w:i/>
+        </w:rPr>
+        <w:t xml:space="preserve">(Tourism)</w:t>
+      </w:r>
+      <w:r>
+        <w:t xml:space="preserve"> </w:t>
+      </w:r>
+      <w:r>
+        <w:t xml:space="preserve">— Lodge and restaurant website with full menu integration and responsive design for tourism visitors.</w:t>
+      </w:r>
+    </w:p>
+    <w:p>
+      <w:pPr>
+        <w:pStyle w:val="BodyText"/>
+      </w:pPr>
+      <w:r>
+        <w:rPr>
+          <w:b/>
+        </w:rPr>
+        <w:t xml:space="preserve">Warpath Industries</w:t>
+      </w:r>
+      <w:r>
+        <w:t xml:space="preserve"> </w:t>
+      </w:r>
+      <w:r>
+        <w:rPr>
+          <w:i/>
+        </w:rPr>
+        <w:t xml:space="preserve">(Manufacturing)</w:t>
+      </w:r>
+      <w:r>
+        <w:t xml:space="preserve"> </w:t>
+      </w:r>
+      <w:r>
+        <w:t xml:space="preserve">— Company capabilities and product line showcase with animated homepage intro.</w:t>
+      </w:r>
+    </w:p>
+    <w:p>
+      <w:pPr>
+        <w:pStyle w:val="BodyText"/>
+      </w:pPr>
+      <w:r>
+        <w:rPr>
+          <w:b/>
+        </w:rPr>
+        <w:t xml:space="preserve">Level 7 Motorsports</w:t>
+      </w:r>
+      <w:r>
+        <w:t xml:space="preserve"> </w:t>
+      </w:r>
+      <w:r>
+        <w:rPr>
+          <w:i/>
+        </w:rPr>
+        <w:t xml:space="preserve">(Manufacturing)</w:t>
+      </w:r>
+      <w:r>
+        <w:t xml:space="preserve"> </w:t>
+      </w:r>
+      <w:r>
+        <w:t xml:space="preserve">— Motorsports lifestyle brand with dynamic homepage, editorial content templates, and single-post layouts.</w:t>
+      </w:r>
+    </w:p>
+    <w:p>
+      <w:pPr>
+        <w:pStyle w:val="BodyText"/>
+      </w:pPr>
+      <w:r>
+        <w:rPr>
+          <w:b/>
+        </w:rPr>
+        <w:t xml:space="preserve">Images Framing</w:t>
+      </w:r>
+      <w:r>
+        <w:t xml:space="preserve"> </w:t>
+      </w:r>
+      <w:r>
+        <w:rPr>
+          <w:i/>
+        </w:rPr>
+        <w:t xml:space="preserve">(Retail)</w:t>
+      </w:r>
+      <w:r>
+        <w:t xml:space="preserve"> </w:t>
+      </w:r>
+      <w:r>
+        <w:t xml:space="preserve">— Custom framing shop with services showcase and clean product-focused layout.</w:t>
+      </w:r>
+    </w:p>
+    <w:p>
+      <w:pPr>
+        <w:pStyle w:val="BodyText"/>
+      </w:pPr>
+      <w:r>
+        <w:rPr>
+          <w:b/>
+        </w:rPr>
+        <w:t xml:space="preserve">Chef Clash</w:t>
+      </w:r>
+      <w:r>
+        <w:t xml:space="preserve"> </w:t>
+      </w:r>
+      <w:r>
+        <w:rPr>
+          <w:i/>
+        </w:rPr>
+        <w:t xml:space="preserve">(Non-Profit)</w:t>
+      </w:r>
+      <w:r>
+        <w:t xml:space="preserve"> </w:t>
+      </w:r>
+      <w:r>
+        <w:t xml:space="preserve">— Full fundraising platform for a live charitable cooking event — separate donor and recipient user flows, event management, and real-time updates; designed and deployed end-to-end.</w:t>
+      </w:r>
+    </w:p>
+    <w:p>
+      <w:pPr>
+        <w:pStyle w:val="BodyText"/>
+      </w:pPr>
+      <w:r>
+        <w:rPr>
+          <w:b/>
+        </w:rPr>
+        <w:t xml:space="preserve">Boys &amp; Girls Club</w:t>
+      </w:r>
+      <w:r>
+        <w:t xml:space="preserve"> </w:t>
+      </w:r>
+      <w:r>
+        <w:rPr>
+          <w:i/>
+        </w:rPr>
+        <w:t xml:space="preserve">(Non-Profit)</w:t>
+      </w:r>
+      <w:r>
+        <w:t xml:space="preserve"> </w:t>
+      </w:r>
+      <w:r>
+        <w:t xml:space="preserve">— Chapter website with membership signup, program pages, and community-focused design.</w:t>
+      </w:r>
+    </w:p>
+    <w:p>
+      <w:pPr>
+        <w:pStyle w:val="BodyText"/>
+      </w:pPr>
+      <w:r>
+        <w:rPr>
+          <w:b/>
+        </w:rPr>
+        <w:t xml:space="preserve">Cedar Court Imaging</w:t>
+      </w:r>
+      <w:r>
+        <w:t xml:space="preserve"> </w:t>
+      </w:r>
+      <w:r>
+        <w:rPr>
+          <w:i/>
+        </w:rPr>
+        <w:t xml:space="preserve">(Healthcare)</w:t>
+      </w:r>
+      <w:r>
+        <w:t xml:space="preserve"> </w:t>
+      </w:r>
+      <w:r>
+        <w:t xml:space="preserve">— Medical imaging center site highlighting advanced scanning technology and patient services.</w:t>
+      </w:r>
+    </w:p>
+    <w:p>
+      <w:pPr>
+        <w:pStyle w:val="BodyText"/>
+      </w:pPr>
+      <w:r>
+        <w:rPr>
+          <w:b/>
+        </w:rPr>
+        <w:t xml:space="preserve">IESO Medical Cannabis</w:t>
+      </w:r>
+      <w:r>
+        <w:t xml:space="preserve"> </w:t>
+      </w:r>
+      <w:r>
+        <w:rPr>
+          <w:i/>
+        </w:rPr>
+        <w:t xml:space="preserve">(Healthcare)</w:t>
+      </w:r>
+      <w:r>
+        <w:t xml:space="preserve"> </w:t>
+      </w:r>
+      <w:r>
+        <w:t xml:space="preserve">— Illinois medical cannabis provider site converted from PSD to HTML with compliant design for patient registration and education.</w:t>
+      </w:r>
+    </w:p>
+    <w:p>
+      <w:pPr>
+        <w:pStyle w:val="BodyText"/>
+      </w:pPr>
+      <w:r>
+        <w:rPr>
+          <w:b/>
+        </w:rPr>
+        <w:t xml:space="preserve">Milano Metal Recycling</w:t>
+      </w:r>
+      <w:r>
+        <w:t xml:space="preserve"> </w:t>
+      </w:r>
+      <w:r>
+        <w:rPr>
+          <w:i/>
+        </w:rPr>
+        <w:t xml:space="preserve">(Manufacturing)</w:t>
+      </w:r>
+      <w:r>
+        <w:t xml:space="preserve"> </w:t>
+      </w:r>
+      <w:r>
+        <w:t xml:space="preserve">— Metal recycling company website covering accepted materials, pricing, and facility info for commercial and residential clients.</w:t>
+      </w:r>
+    </w:p>
+    <w:p>
+      <w:pPr>
+        <w:pStyle w:val="BodyText"/>
+      </w:pPr>
+      <w:r>
+        <w:rPr>
+          <w:b/>
+        </w:rPr>
+        <w:t xml:space="preserve">The Vape Shop</w:t>
+      </w:r>
+      <w:r>
+        <w:t xml:space="preserve"> </w:t>
+      </w:r>
+      <w:r>
+        <w:rPr>
+          <w:i/>
+        </w:rPr>
+        <w:t xml:space="preserve">(Retail)</w:t>
+      </w:r>
+      <w:r>
+        <w:t xml:space="preserve"> </w:t>
+      </w:r>
+      <w:r>
+        <w:t xml:space="preserve">— Vape and e-juice storefront with animated product demos and dynamic inventory presentation.</w:t>
+      </w:r>
+    </w:p>
+    <w:p>
+      <w:pPr>
+        <w:pStyle w:val="BodyText"/>
+      </w:pPr>
+      <w:r>
+        <w:rPr>
+          <w:b/>
+        </w:rPr>
+        <w:t xml:space="preserve">SEO Performance Audit</w:t>
+      </w:r>
+      <w:r>
+        <w:t xml:space="preserve"> </w:t>
+      </w:r>
+      <w:r>
+        <w:rPr>
+          <w:i/>
+        </w:rPr>
+        <w:t xml:space="preserve">(SEO)</w:t>
+      </w:r>
+      <w:r>
+        <w:t xml:space="preserve"> </w:t>
+      </w:r>
+      <w:r>
+        <w:t xml:space="preserve">— Comprehensive site crawl and audit dashboard identifying technical SEO deficiencies with a prioritized remediation roadmap.</w:t>
+      </w:r>
+    </w:p>
+    <w:p>
+      <w:r>
+        <w:pict>
+          <v:rect style="width:0;height:1.5pt" o:hralign="center" o:hrstd="t" o:hr="t"/>
+        </w:pict>
+      </w:r>
+    </w:p>
+    <w:p>
+      <w:pPr>
+        <w:pStyle w:val="Heading1"/>
+      </w:pPr>
+      <w:bookmarkStart w:id="88" w:name="presentations"/>
+      <w:r>
+        <w:t xml:space="preserve">Presentations</w:t>
+      </w:r>
+      <w:bookmarkEnd w:id="88"/>
+    </w:p>
+    <w:p>
+      <w:pPr>
+        <w:pStyle w:val="FirstParagraph"/>
+      </w:pPr>
+      <w:r>
+        <w:rPr>
+          <w:b/>
+        </w:rPr>
+        <w:t xml:space="preserve">Web Confidentiality, Privacy &amp; Security</w:t>
+      </w:r>
+      <w:r>
+        <w:t xml:space="preserve"> </w:t>
+      </w:r>
+      <w:r>
+        <w:rPr>
+          <w:i/>
+        </w:rPr>
+        <w:t xml:space="preserve">BLUG — Boulder, CO (May 2024)</w:t>
+      </w:r>
+      <w:r>
+        <w:t xml:space="preserve"> </w:t>
+      </w:r>
+      <w:r>
+        <w:t xml:space="preserve">Presentation covering fingerprinting vectors, tracker evasion, DNS-over-HTTPS, compartmentalization strategies, and hardened browser profiles for everyday use.</w:t>
+      </w:r>
+      <w:r>
+        <w:t xml:space="preserve"> </w:t>
+      </w:r>
+      <w:hyperlink r:id="rId89">
+        <w:r>
+          <w:rPr>
+            <w:rStyle w:val="Hyperlink"/>
+          </w:rPr>
+          <w:t xml:space="preserve">blog.holtzweb.com/posts/browsers-web-browser-privacy</w:t>
+        </w:r>
+      </w:hyperlink>
+    </w:p>
+    <w:p>
+      <w:pPr>
+        <w:pStyle w:val="BodyText"/>
+      </w:pPr>
+      <w:r>
+        <w:rPr>
+          <w:b/>
+        </w:rPr>
+        <w:t xml:space="preserve">Enterprise Security Across All Devices</w:t>
+      </w:r>
+      <w:r>
+        <w:t xml:space="preserve"> </w:t>
+      </w:r>
+      <w:r>
+        <w:rPr>
+          <w:i/>
+        </w:rPr>
+        <w:t xml:space="preserve">Software Freedom School — Littleton, CO</w:t>
+      </w:r>
+      <w:r>
+        <w:t xml:space="preserve"> </w:t>
+      </w:r>
+      <w:r>
+        <w:t xml:space="preserve">Five-part deep dive into layered home network security: auditing Android traffic (TrackerControl, PCAPdroid, cert-pinning bypass), per-app outbound firewalls on every OS (OpenSnitch, Little Snitch, WFC), router-level visibility with ntopng and Suricata IDS/IPS, anonymous exit strategies (Tor, I2P, XRAY), and a hardened home network stack built on OpenWRT and OPNsense.</w:t>
+      </w:r>
+      <w:r>
+        <w:t xml:space="preserve"> </w:t>
+      </w:r>
+      <w:hyperlink r:id="rId90">
+        <w:r>
+          <w:rPr>
+            <w:rStyle w:val="Hyperlink"/>
+          </w:rPr>
+          <w:t xml:space="preserve">holtzweb.com/talks/home_network_security</w:t>
+        </w:r>
+      </w:hyperlink>
+    </w:p>
+    <w:p>
+      <w:pPr>
+        <w:pStyle w:val="BodyText"/>
+      </w:pPr>
+      <w:r>
+        <w:rPr>
+          <w:b/>
+        </w:rPr>
+        <w:t xml:space="preserve">Automate Custom Deployments with Cloud-init</w:t>
+      </w:r>
+      <w:r>
+        <w:t xml:space="preserve"> </w:t>
+      </w:r>
+      <w:r>
+        <w:rPr>
+          <w:i/>
+        </w:rPr>
+        <w:t xml:space="preserve">Software Freedom School — Littleton, CO (August 2023)</w:t>
+      </w:r>
+      <w:r>
+        <w:t xml:space="preserve"> </w:t>
+      </w:r>
+      <w:r>
+        <w:t xml:space="preserve">Practical guide to writing reusable Cloud-init templates for provisioning users, packages, SSH keys, and services from a single declarative config at first boot — enabling repeatable fleet deployments at scale.</w:t>
+      </w:r>
+      <w:r>
+        <w:t xml:space="preserve"> </w:t>
+      </w:r>
+      <w:hyperlink r:id="rId91">
+        <w:r>
+          <w:rPr>
+            <w:rStyle w:val="Hyperlink"/>
+          </w:rPr>
+          <w:t xml:space="preserve">gitlab.com/marcusholtz/sfs</w:t>
+        </w:r>
+      </w:hyperlink>
+    </w:p>
+    <w:p>
+      <w:pPr>
+        <w:pStyle w:val="BodyText"/>
+      </w:pPr>
+      <w:r>
+        <w:rPr>
+          <w:b/>
+        </w:rPr>
+        <w:t xml:space="preserve">OpenWRT Network Infrastructure</w:t>
+      </w:r>
+      <w:r>
+        <w:t xml:space="preserve"> </w:t>
+      </w:r>
+      <w:r>
+        <w:rPr>
+          <w:i/>
+        </w:rPr>
+        <w:t xml:space="preserve">Software Freedom School — Littleton, CO (April 2023)</w:t>
+      </w:r>
+      <w:r>
+        <w:t xml:space="preserve"> </w:t>
+      </w:r>
+      <w:r>
+        <w:t xml:space="preserve">Custom router firmware ecosystem overview covering 1,500+ supported devices, OpenWRT build systems, package management, and enterprise-grade features on consumer hardware.</w:t>
+      </w:r>
+      <w:r>
+        <w:t xml:space="preserve"> </w:t>
+      </w:r>
+      <w:hyperlink r:id="rId92">
+        <w:r>
+          <w:rPr>
+            <w:rStyle w:val="Hyperlink"/>
+          </w:rPr>
+          <w:t xml:space="preserve">holtzweb.com/openwrt-presentation.html</w:t>
+        </w:r>
+      </w:hyperlink>
+    </w:p>
+    <w:p>
+      <w:pPr>
+        <w:pStyle w:val="BodyText"/>
+      </w:pPr>
+      <w:r>
+        <w:rPr>
+          <w:b/>
+        </w:rPr>
+        <w:t xml:space="preserve">Browser Privacy</w:t>
+      </w:r>
+      <w:r>
+        <w:t xml:space="preserve"> </w:t>
+      </w:r>
+      <w:r>
+        <w:rPr>
+          <w:i/>
+        </w:rPr>
+        <w:t xml:space="preserve">BLUG — Boulder, CO (November 2022) | Software Freedom School (September 2022)</w:t>
+      </w:r>
+      <w:r>
+        <w:t xml:space="preserve"> </w:t>
+      </w:r>
+      <w:r>
+        <w:t xml:space="preserve">Audience-interactive session on understanding data collection by browsers and tools, with live opt-in/opt-out demonstrations.</w:t>
+      </w:r>
+      <w:r>
+        <w:t xml:space="preserve"> </w:t>
+      </w:r>
+      <w:hyperlink r:id="rId93">
+        <w:r>
+          <w:rPr>
+            <w:rStyle w:val="Hyperlink"/>
+          </w:rPr>
+          <w:t xml:space="preserve">Slides</w:t>
+        </w:r>
+      </w:hyperlink>
+      <w:r>
+        <w:t xml:space="preserve"> </w:t>
+      </w:r>
+      <w:r>
+        <w:t xml:space="preserve">|</w:t>
+      </w:r>
+      <w:r>
+        <w:t xml:space="preserve"> </w:t>
+      </w:r>
+      <w:hyperlink r:id="rId94">
+        <w:r>
+          <w:rPr>
+            <w:rStyle w:val="Hyperlink"/>
+          </w:rPr>
+          <w:t xml:space="preserve">Video</w:t>
+        </w:r>
+      </w:hyperlink>
+    </w:p>
+    <w:p>
+      <w:pPr>
+        <w:pStyle w:val="BodyText"/>
+      </w:pPr>
+      <w:r>
+        <w:rPr>
+          <w:b/>
+        </w:rPr>
+        <w:t xml:space="preserve">Self-Hosted Social Networking Services (Mastodon)</w:t>
+      </w:r>
+      <w:r>
+        <w:t xml:space="preserve"> </w:t>
+      </w:r>
+      <w:r>
+        <w:rPr>
+          <w:i/>
+        </w:rPr>
+        <w:t xml:space="preserve">Software Freedom School — Littleton, CO (December 2022)</w:t>
+      </w:r>
+      <w:r>
+        <w:t xml:space="preserve"> </w:t>
+      </w:r>
+      <w:r>
+        <w:t xml:space="preserve">Hands-on walkthrough of deploying Mastodon, configuring ActivityPub federation, and operating decentralized social infrastructure on private hardware.</w:t>
+      </w:r>
+      <w:r>
+        <w:t xml:space="preserve"> </w:t>
+      </w:r>
+      <w:hyperlink r:id="rId95">
+        <w:r>
+          <w:rPr>
+            <w:rStyle w:val="Hyperlink"/>
+          </w:rPr>
+          <w:t xml:space="preserve">Slides</w:t>
+        </w:r>
+      </w:hyperlink>
+      <w:r>
+        <w:t xml:space="preserve"> </w:t>
+      </w:r>
+      <w:r>
+        <w:t xml:space="preserve">|</w:t>
+      </w:r>
+      <w:r>
+        <w:t xml:space="preserve"> </w:t>
+      </w:r>
+      <w:hyperlink r:id="rId96">
+        <w:r>
+          <w:rPr>
+            <w:rStyle w:val="Hyperlink"/>
+          </w:rPr>
+          <w:t xml:space="preserve">Video</w:t>
+        </w:r>
+      </w:hyperlink>
+    </w:p>
+    <w:p>
+      <w:pPr>
+        <w:pStyle w:val="BodyText"/>
+      </w:pPr>
+      <w:r>
+        <w:rPr>
+          <w:b/>
+        </w:rPr>
+        <w:t xml:space="preserve">Homelab: Introduction to Self-Hosting</w:t>
+      </w:r>
+      <w:r>
+        <w:t xml:space="preserve"> </w:t>
+      </w:r>
+      <w:r>
+        <w:rPr>
+          <w:i/>
+        </w:rPr>
+        <w:t xml:space="preserve">Software Freedom School — Littleton, CO</w:t>
+      </w:r>
+      <w:r>
+        <w:t xml:space="preserve"> </w:t>
+      </w:r>
+      <w:r>
+        <w:t xml:space="preserve">Beginner-to-intermediate guide covering motivations (privacy, learning, custom solutions), a four-step framework for getting started, hardware choices from Raspberry Pi to rack servers, and real-world use cases: home automation, media streaming, file storage, and password management.</w:t>
+      </w:r>
+      <w:r>
+        <w:t xml:space="preserve"> </w:t>
+      </w:r>
+      <w:hyperlink r:id="rId97">
+        <w:r>
+          <w:rPr>
+            <w:rStyle w:val="Hyperlink"/>
+          </w:rPr>
+          <w:t xml:space="preserve">holtzweb.com/talks/homelab</w:t>
+        </w:r>
+      </w:hyperlink>
+    </w:p>
+    <w:p>
+      <w:r>
+        <w:pict>
+          <v:rect style="width:0;height:1.5pt" o:hralign="center" o:hrstd="t" o:hr="t"/>
+        </w:pict>
+      </w:r>
+    </w:p>
+    <w:p>
+      <w:pPr>
+        <w:pStyle w:val="Heading1"/>
+      </w:pPr>
+      <w:bookmarkStart w:id="98" w:name="industry-experience"/>
+      <w:r>
+        <w:t xml:space="preserve">Industry Experience</w:t>
+      </w:r>
+      <w:bookmarkEnd w:id="98"/>
+    </w:p>
+    <w:p>
+      <w:pPr>
+        <w:pStyle w:val="Heading2"/>
+      </w:pPr>
+      <w:bookmarkStart w:id="99" w:name="it-consulting-systems-engineering"/>
+      <w:r>
+        <w:t xml:space="preserve">IT Consulting &amp; Systems Engineering</w:t>
+      </w:r>
+      <w:bookmarkEnd w:id="99"/>
+    </w:p>
+    <w:p>
+      <w:pPr>
+        <w:pStyle w:val="FirstParagraph"/>
+      </w:pPr>
+      <w:r>
+        <w:t xml:space="preserve">**Holtzweb / Holtzhost — Denver, CO</w:t>
+      </w:r>
+      <w:r>
+        <w:rPr>
+          <w:i/>
+        </w:rPr>
+        <w:t xml:space="preserve">2019 – Present</w:t>
+      </w:r>
     </w:p>
     <w:p>
       <w:pPr>
@@ -723,7 +2796,21 @@
         <w:pStyle w:val="Compact"/>
       </w:pPr>
       <w:r>
-        <w:t xml:space="preserve">• Designed and built custom website layout/user interfaces and custom backend software to meet project deadline/requirements.</w:t>
+        <w:t xml:space="preserve">Architect and maintain self-hosted, privacy-first hosting infrastructure for clients under</w:t>
+      </w:r>
+      <w:r>
+        <w:t xml:space="preserve"> </w:t>
+      </w:r>
+      <w:hyperlink r:id="rId100">
+        <w:r>
+          <w:rPr>
+            <w:rStyle w:val="Hyperlink"/>
+          </w:rPr>
+          <w:t xml:space="preserve">holtzhost.com</w:t>
+        </w:r>
+      </w:hyperlink>
+      <w:r>
+        <w:t xml:space="preserve">, running entirely on self-owned servers.</w:t>
       </w:r>
     </w:p>
     <w:p>
@@ -735,19 +2822,7 @@
         <w:pStyle w:val="Compact"/>
       </w:pPr>
       <w:r>
-        <w:t xml:space="preserve">• Integrated data from various back-end services and databases:</w:t>
-      </w:r>
-    </w:p>
-    <w:p>
-      <w:pPr>
-        <w:numPr>
-          <w:ilvl w:val="1"/>
-          <w:numId w:val="1015"/>
-        </w:numPr>
-        <w:pStyle w:val="Compact"/>
-      </w:pPr>
-      <w:r>
-        <w:t xml:space="preserve">election data, employee database, interactive event map</w:t>
+        <w:t xml:space="preserve">Establish cloud hosting environments, virtualization platforms, and operations tooling for client organizations across multiple industries.</w:t>
       </w:r>
     </w:p>
     <w:p>
@@ -759,97 +2834,143 @@
         <w:pStyle w:val="Compact"/>
       </w:pPr>
       <w:r>
-        <w:t xml:space="preserve">• Fixed broken installs, hacked sites, busted databases, and never-been-updated themes/plugins.</w:t>
-      </w:r>
-    </w:p>
-    <w:p>
-      <w:pPr>
-        <w:pStyle w:val="Heading1"/>
-      </w:pPr>
-      <w:bookmarkStart w:id="40" w:name="technical-projects"/>
-      <w:r>
-        <w:t xml:space="preserve">Technical Projects</w:t>
-      </w:r>
-      <w:bookmarkEnd w:id="40"/>
+        <w:t xml:space="preserve">Deliver SEO/SEM strategy and execution across web, email newsletters, and paid channels — achieving measurable increases in both web and in-person traffic (40%+ lift for select clients).</w:t>
+      </w:r>
+    </w:p>
+    <w:p>
+      <w:pPr>
+        <w:numPr>
+          <w:ilvl w:val="0"/>
+          <w:numId w:val="1014"/>
+        </w:numPr>
+        <w:pStyle w:val="Compact"/>
+      </w:pPr>
+      <w:r>
+        <w:t xml:space="preserve">Operate a full-service IT helpdesk, network and server design practice, and WordPress/custom-build web development shop under</w:t>
+      </w:r>
+      <w:r>
+        <w:t xml:space="preserve"> </w:t>
+      </w:r>
+      <w:hyperlink r:id="rId101">
+        <w:r>
+          <w:rPr>
+            <w:rStyle w:val="Hyperlink"/>
+          </w:rPr>
+          <w:t xml:space="preserve">holtzweb.com</w:t>
+        </w:r>
+      </w:hyperlink>
+      <w:r>
+        <w:t xml:space="preserve">.</w:t>
+      </w:r>
     </w:p>
     <w:p>
       <w:pPr>
         <w:pStyle w:val="Heading2"/>
       </w:pPr>
-      <w:bookmarkStart w:id="41" w:name="homelab"/>
-      <w:r>
-        <w:t xml:space="preserve">Homelab</w:t>
-      </w:r>
-      <w:bookmarkEnd w:id="41"/>
+      <w:bookmarkStart w:id="102" w:name="leadership-community"/>
+      <w:r>
+        <w:t xml:space="preserve">Leadership &amp; Community</w:t>
+      </w:r>
+      <w:bookmarkEnd w:id="102"/>
     </w:p>
     <w:p>
       <w:pPr>
         <w:pStyle w:val="FirstParagraph"/>
       </w:pPr>
-      <w:hyperlink r:id="rId42">
-        <w:r>
-          <w:rPr>
-            <w:rStyle w:val="Hyperlink"/>
-          </w:rPr>
-          <w:t xml:space="preserve">My homelab</w:t>
-        </w:r>
-      </w:hyperlink>
-      <w:r>
-        <w:t xml:space="preserve"> </w:t>
-      </w:r>
-      <w:r>
-        <w:t xml:space="preserve">features</w:t>
-      </w:r>
-      <w:r>
-        <w:t xml:space="preserve"> </w:t>
-      </w:r>
-      <w:hyperlink r:id="rId43">
-        <w:r>
-          <w:rPr>
-            <w:rStyle w:val="Hyperlink"/>
-          </w:rPr>
-          <w:t xml:space="preserve">VLAN network segregation</w:t>
-        </w:r>
-      </w:hyperlink>
-      <w:r>
-        <w:t xml:space="preserve">, 6 VMs, ~100 containers, and multi-tier snapshoting.</w:t>
-      </w:r>
-    </w:p>
-    <w:p>
-      <w:pPr>
-        <w:pStyle w:val="Heading1"/>
-      </w:pPr>
-      <w:bookmarkStart w:id="44" w:name="presentations"/>
-      <w:r>
-        <w:t xml:space="preserve">Presentations</w:t>
-      </w:r>
-      <w:bookmarkEnd w:id="44"/>
+      <w:r>
+        <w:t xml:space="preserve">**Software Freedom School — Littleton, CO</w:t>
+      </w:r>
+      <w:r>
+        <w:rPr>
+          <w:i/>
+        </w:rPr>
+        <w:t xml:space="preserve">2022 – 2024</w:t>
+      </w:r>
+    </w:p>
+    <w:p>
+      <w:pPr>
+        <w:numPr>
+          <w:ilvl w:val="0"/>
+          <w:numId w:val="1015"/>
+        </w:numPr>
+        <w:pStyle w:val="Compact"/>
+      </w:pPr>
+      <w:r>
+        <w:t xml:space="preserve">Served as board member from March 2023 through 2024; contributed to organizational direction and technology strategy.</w:t>
+      </w:r>
+    </w:p>
+    <w:p>
+      <w:pPr>
+        <w:numPr>
+          <w:ilvl w:val="0"/>
+          <w:numId w:val="1015"/>
+        </w:numPr>
+        <w:pStyle w:val="Compact"/>
+      </w:pPr>
+      <w:r>
+        <w:t xml:space="preserve">Maintained and triaged open tickets on the</w:t>
+      </w:r>
+      <w:r>
+        <w:t xml:space="preserve"> </w:t>
+      </w:r>
+      <w:hyperlink r:id="rId103">
+        <w:r>
+          <w:rPr>
+            <w:rStyle w:val="Hyperlink"/>
+          </w:rPr>
+          <w:t xml:space="preserve">SysOps board</w:t>
+        </w:r>
+      </w:hyperlink>
+      <w:r>
+        <w:t xml:space="preserve">.</w:t>
+      </w:r>
+    </w:p>
+    <w:p>
+      <w:pPr>
+        <w:numPr>
+          <w:ilvl w:val="0"/>
+          <w:numId w:val="1015"/>
+        </w:numPr>
+        <w:pStyle w:val="Compact"/>
+      </w:pPr>
+      <w:r>
+        <w:t xml:space="preserve">Delivered seven public talks on systems, networking, privacy, and security topics at monthly community meetings.</w:t>
+      </w:r>
+    </w:p>
+    <w:p>
+      <w:pPr>
+        <w:numPr>
+          <w:ilvl w:val="0"/>
+          <w:numId w:val="1015"/>
+        </w:numPr>
+        <w:pStyle w:val="Compact"/>
+      </w:pPr>
+      <w:r>
+        <w:t xml:space="preserve">Participated in weekly Linux study group as both student and presenter.</w:t>
+      </w:r>
     </w:p>
     <w:p>
       <w:pPr>
         <w:pStyle w:val="Heading2"/>
       </w:pPr>
-      <w:bookmarkStart w:id="45" w:name="browser-privacy"/>
-      <w:r>
-        <w:t xml:space="preserve">Browser Privacy</w:t>
-      </w:r>
-      <w:bookmarkEnd w:id="45"/>
+      <w:bookmarkStart w:id="104" w:name="web-development-1"/>
+      <w:r>
+        <w:t xml:space="preserve">Web Development</w:t>
+      </w:r>
+      <w:bookmarkEnd w:id="104"/>
     </w:p>
     <w:p>
       <w:pPr>
         <w:pStyle w:val="FirstParagraph"/>
       </w:pPr>
       <w:r>
-        <w:rPr>
-          <w:b/>
-        </w:rPr>
-        <w:t xml:space="preserve">The goal of this talk is to put you in control.</w:t>
-      </w:r>
-      <w:r>
-        <w:t xml:space="preserve"> </w:t>
-      </w:r>
-      <w:r>
-        <w:t xml:space="preserve">Understand what data is collected by the tools you use and decide if you want to share it. Then use methods provided here to opt-in or opt-out.</w:t>
+        <w:t xml:space="preserve">**Highline Ideas · 1187 · Mayer Networks — Carbondale, IL</w:t>
+      </w:r>
+      <w:r>
+        <w:rPr>
+          <w:i/>
+        </w:rPr>
+        <w:t xml:space="preserve">2013 – 2017</w:t>
       </w:r>
     </w:p>
     <w:p>
@@ -858,21 +2979,11 @@
           <w:ilvl w:val="0"/>
           <w:numId w:val="1016"/>
         </w:numPr>
-      </w:pPr>
-      <w:r>
-        <w:t xml:space="preserve">* BLUG (Boulder Linux Users Group) -</w:t>
-      </w:r>
-      <w:r>
-        <w:t xml:space="preserve"> </w:t>
-      </w:r>
-      <w:hyperlink r:id="rId46">
-        <w:r>
-          <w:rPr>
-            <w:rStyle w:val="Hyperlink"/>
-          </w:rPr>
-          <w:t xml:space="preserve">11/10/22</w:t>
-        </w:r>
-      </w:hyperlink>
+        <w:pStyle w:val="Compact"/>
+      </w:pPr>
+      <w:r>
+        <w:t xml:space="preserve">Designed and built custom website layouts, user interfaces, and backend systems tailored to individual client requirements and deadlines.</w:t>
+      </w:r>
     </w:p>
     <w:p>
       <w:pPr>
@@ -880,242 +2991,76 @@
           <w:ilvl w:val="0"/>
           <w:numId w:val="1016"/>
         </w:numPr>
-      </w:pPr>
-      <w:r>
-        <w:t xml:space="preserve">* SFS (Software Freedom School) -</w:t>
-      </w:r>
-      <w:r>
-        <w:t xml:space="preserve"> </w:t>
-      </w:r>
-      <w:hyperlink r:id="rId47">
-        <w:r>
-          <w:rPr>
-            <w:rStyle w:val="Hyperlink"/>
-          </w:rPr>
-          <w:t xml:space="preserve">9/3/22</w:t>
-        </w:r>
-      </w:hyperlink>
+        <w:pStyle w:val="Compact"/>
+      </w:pPr>
+      <w:r>
+        <w:t xml:space="preserve">Integrated external data sources including election data, employee directories, and interactive event mapping.</w:t>
+      </w:r>
     </w:p>
     <w:p>
       <w:pPr>
         <w:numPr>
-          <w:ilvl w:val="3"/>
-          <w:numId w:val="1019"/>
+          <w:ilvl w:val="0"/>
+          <w:numId w:val="1016"/>
         </w:numPr>
         <w:pStyle w:val="Compact"/>
       </w:pPr>
-      <w:hyperlink r:id="rId48">
-        <w:r>
-          <w:rPr>
-            <w:rStyle w:val="Hyperlink"/>
-          </w:rPr>
-          <w:t xml:space="preserve">Link to Slides</w:t>
-        </w:r>
-      </w:hyperlink>
-      <w:r>
-        <w:t xml:space="preserve"> </w:t>
-      </w:r>
-      <w:r>
-        <w:t xml:space="preserve">|</w:t>
-      </w:r>
-      <w:r>
-        <w:t xml:space="preserve"> </w:t>
-      </w:r>
-      <w:hyperlink r:id="rId49">
-        <w:r>
-          <w:rPr>
-            <w:rStyle w:val="Hyperlink"/>
-          </w:rPr>
-          <w:t xml:space="preserve">Link to Video</w:t>
-        </w:r>
-      </w:hyperlink>
-    </w:p>
-    <w:p>
-      <w:pPr>
-        <w:pStyle w:val="Heading2"/>
-      </w:pPr>
-      <w:bookmarkStart w:id="50" w:name="opensource-firmware-on-routers"/>
-      <w:r>
-        <w:t xml:space="preserve">Opensource Firmware on Routers</w:t>
-      </w:r>
-      <w:bookmarkEnd w:id="50"/>
-    </w:p>
-    <w:p>
-      <w:pPr>
-        <w:pStyle w:val="FirstParagraph"/>
-      </w:pPr>
-      <w:r>
-        <w:rPr>
-          <w:b/>
-        </w:rPr>
-        <w:t xml:space="preserve">What can Opensource do for home consumer routers?</w:t>
-      </w:r>
-      <w:r>
-        <w:t xml:space="preserve"> </w:t>
-      </w:r>
-      <w:r>
-        <w:t xml:space="preserve">OpenWRT supports more than 1,500 devices most capable of the line enterprise features: Bandwith Monitoring, Guest Portal, Cloudbased IPS.</w:t>
+      <w:r>
+        <w:t xml:space="preserve">Worked directly with clients to translate business and marketing goals into technical specifications.</w:t>
       </w:r>
     </w:p>
     <w:p>
       <w:pPr>
         <w:numPr>
           <w:ilvl w:val="0"/>
-          <w:numId w:val="1020"/>
-        </w:numPr>
-      </w:pPr>
-      <w:r>
-        <w:t xml:space="preserve">* SFS (Software Freedom School) -</w:t>
-      </w:r>
-      <w:r>
-        <w:t xml:space="preserve"> </w:t>
-      </w:r>
-      <w:hyperlink r:id="rId51">
-        <w:r>
-          <w:rPr>
-            <w:rStyle w:val="Hyperlink"/>
-          </w:rPr>
-          <w:t xml:space="preserve">4/1/23</w:t>
-        </w:r>
-      </w:hyperlink>
-    </w:p>
-    <w:p>
-      <w:pPr>
-        <w:numPr>
-          <w:ilvl w:val="3"/>
-          <w:numId w:val="1023"/>
+          <w:numId w:val="1016"/>
         </w:numPr>
         <w:pStyle w:val="Compact"/>
       </w:pPr>
-      <w:hyperlink r:id="rId52">
-        <w:r>
-          <w:rPr>
-            <w:rStyle w:val="Hyperlink"/>
-          </w:rPr>
-          <w:t xml:space="preserve">Link to Slides</w:t>
-        </w:r>
-      </w:hyperlink>
-      <w:r>
-        <w:t xml:space="preserve"> </w:t>
-      </w:r>
-      <w:r>
-        <w:t xml:space="preserve">|</w:t>
-      </w:r>
-      <w:r>
-        <w:t xml:space="preserve"> </w:t>
-      </w:r>
-      <w:hyperlink r:id="rId53">
-        <w:r>
-          <w:rPr>
-            <w:rStyle w:val="Hyperlink"/>
-          </w:rPr>
-          <w:t xml:space="preserve">Link to Markdown</w:t>
-        </w:r>
-      </w:hyperlink>
-    </w:p>
-    <w:p>
-      <w:pPr>
-        <w:pStyle w:val="Heading2"/>
-      </w:pPr>
-      <w:bookmarkStart w:id="54" w:name="mastodon"/>
-      <w:r>
-        <w:t xml:space="preserve">Mastodon</w:t>
-      </w:r>
-      <w:bookmarkEnd w:id="54"/>
-    </w:p>
-    <w:p>
-      <w:pPr>
-        <w:pStyle w:val="FirstParagraph"/>
-      </w:pPr>
-      <w:r>
-        <w:rPr>
-          <w:b/>
-        </w:rPr>
-        <w:t xml:space="preserve">Self-Hosted, Open Source, Federated, Decentralized… social media?</w:t>
-      </w:r>
-      <w:r>
-        <w:t xml:space="preserve"> </w:t>
-      </w:r>
-      <w:r>
-        <w:t xml:space="preserve">Mastodon is software for running different, connected social networking services with microblogging features.</w:t>
+      <w:r>
+        <w:t xml:space="preserve">Executed SEO initiatives, web analytics analysis, and third-party A/B testing and optimization.</w:t>
       </w:r>
     </w:p>
     <w:p>
       <w:pPr>
         <w:numPr>
-          <w:ilvl w:val="1"/>
-          <w:numId w:val="1025"/>
+          <w:ilvl w:val="0"/>
+          <w:numId w:val="1016"/>
         </w:numPr>
         <w:pStyle w:val="Compact"/>
       </w:pPr>
       <w:r>
-        <w:t xml:space="preserve">* SFS (Software Freedom School) -</w:t>
-      </w:r>
-      <w:r>
-        <w:t xml:space="preserve"> </w:t>
-      </w:r>
-      <w:hyperlink r:id="rId55">
-        <w:r>
-          <w:rPr>
-            <w:rStyle w:val="Hyperlink"/>
-          </w:rPr>
-          <w:t xml:space="preserve">12/3/22</w:t>
-        </w:r>
-      </w:hyperlink>
+        <w:t xml:space="preserve">Enforced web standards and ADA/WCAG accessibility compliance across all delivered sites.</w:t>
+      </w:r>
     </w:p>
     <w:p>
       <w:pPr>
         <w:numPr>
-          <w:ilvl w:val="3"/>
-          <w:numId w:val="1028"/>
+          <w:ilvl w:val="0"/>
+          <w:numId w:val="1016"/>
         </w:numPr>
         <w:pStyle w:val="Compact"/>
       </w:pPr>
-      <w:hyperlink r:id="rId56">
-        <w:r>
-          <w:rPr>
-            <w:rStyle w:val="Hyperlink"/>
-          </w:rPr>
-          <w:t xml:space="preserve">Link to Slides</w:t>
-        </w:r>
-      </w:hyperlink>
-      <w:r>
-        <w:t xml:space="preserve"> </w:t>
-      </w:r>
-      <w:r>
-        <w:t xml:space="preserve">|</w:t>
-      </w:r>
-      <w:r>
-        <w:t xml:space="preserve"> </w:t>
-      </w:r>
-      <w:hyperlink r:id="rId57">
-        <w:r>
-          <w:rPr>
-            <w:rStyle w:val="Hyperlink"/>
-          </w:rPr>
-          <w:t xml:space="preserve">Link to Video</w:t>
-        </w:r>
-      </w:hyperlink>
+      <w:r>
+        <w:t xml:space="preserve">Diagnosed and repaired broken CMS installs, compromised sites, corrupted databases, and outdated plugin stacks.</w:t>
+      </w:r>
+    </w:p>
+    <w:p>
+      <w:r>
+        <w:pict>
+          <v:rect style="width:0;height:1.5pt" o:hralign="center" o:hrstd="t" o:hr="t"/>
+        </w:pict>
+      </w:r>
     </w:p>
     <w:p>
       <w:pPr>
         <w:pStyle w:val="Heading1"/>
       </w:pPr>
-      <w:bookmarkStart w:id="58" w:name="industry-experience"/>
-      <w:r>
-        <w:t xml:space="preserve">Industry Experience</w:t>
-      </w:r>
-      <w:bookmarkEnd w:id="58"/>
-    </w:p>
-    <w:p>
-      <w:pPr>
-        <w:pStyle w:val="Heading2"/>
-      </w:pPr>
-      <w:bookmarkStart w:id="59" w:name="leadership-activies"/>
-      <w:r>
-        <w:t xml:space="preserve">Leadership Activies</w:t>
-      </w:r>
-      <w:bookmarkEnd w:id="59"/>
+      <w:bookmarkStart w:id="105" w:name="education"/>
+      <w:r>
+        <w:t xml:space="preserve">Education</w:t>
+      </w:r>
+      <w:bookmarkEnd w:id="105"/>
     </w:p>
     <w:p>
       <w:pPr>
@@ -1125,92 +3070,40 @@
         <w:rPr>
           <w:b/>
         </w:rPr>
-        <w:t xml:space="preserve">Software Freedom School, Littleton, CO</w:t>
-      </w:r>
-      <w:r>
-        <w:t xml:space="preserve"> </w:t>
-      </w:r>
-      <w:r>
-        <w:t xml:space="preserve">-</w:t>
-      </w:r>
-      <w:r>
-        <w:t xml:space="preserve"> </w:t>
-      </w:r>
-      <w:r>
-        <w:rPr>
-          <w:b/>
-        </w:rPr>
-        <w:t xml:space="preserve">2022 - Present</w:t>
-      </w:r>
-    </w:p>
-    <w:p>
-      <w:pPr>
-        <w:numPr>
-          <w:ilvl w:val="0"/>
-          <w:numId w:val="1029"/>
-        </w:numPr>
-        <w:pStyle w:val="Compact"/>
-      </w:pPr>
-      <w:r>
-        <w:t xml:space="preserve">• Software Freedom School board member since March 2023</w:t>
-      </w:r>
-    </w:p>
-    <w:p>
-      <w:pPr>
-        <w:numPr>
-          <w:ilvl w:val="0"/>
-          <w:numId w:val="1029"/>
-        </w:numPr>
-        <w:pStyle w:val="Compact"/>
-      </w:pPr>
-      <w:r>
-        <w:t xml:space="preserve">• Maintain open tickets for</w:t>
-      </w:r>
-      <w:r>
-        <w:t xml:space="preserve"> </w:t>
-      </w:r>
-      <w:hyperlink r:id="rId60">
-        <w:r>
-          <w:rPr>
-            <w:rStyle w:val="Hyperlink"/>
-          </w:rPr>
-          <w:t xml:space="preserve">SysOps board</w:t>
-        </w:r>
-      </w:hyperlink>
-    </w:p>
-    <w:p>
-      <w:pPr>
-        <w:numPr>
-          <w:ilvl w:val="0"/>
-          <w:numId w:val="1029"/>
-        </w:numPr>
-        <w:pStyle w:val="Compact"/>
-      </w:pPr>
-      <w:r>
-        <w:t xml:space="preserve">• Presented at monthly community meetings</w:t>
-      </w:r>
-    </w:p>
-    <w:p>
-      <w:pPr>
-        <w:numPr>
-          <w:ilvl w:val="0"/>
-          <w:numId w:val="1029"/>
-        </w:numPr>
-        <w:pStyle w:val="Compact"/>
-      </w:pPr>
-      <w:r>
-        <w:t xml:space="preserve">• Team Member in weekly Linux study group</w:t>
-      </w:r>
-    </w:p>
-    <w:p>
-      <w:pPr>
-        <w:pStyle w:val="Heading2"/>
-      </w:pPr>
-      <w:bookmarkStart w:id="61" w:name="it-and-web-consultation-freelancing"/>
-      <w:r>
-        <w:t xml:space="preserve">IT and Web Consultation / Freelancing</w:t>
-      </w:r>
-      <w:bookmarkEnd w:id="61"/>
+        <w:t xml:space="preserve">BS in Finance</w:t>
+      </w:r>
+      <w:r>
+        <w:t xml:space="preserve"> </w:t>
+      </w:r>
+      <w:r>
+        <w:t xml:space="preserve">— Southern Illinois University Carbondale |</w:t>
+      </w:r>
+      <w:r>
+        <w:t xml:space="preserve"> </w:t>
+      </w:r>
+      <w:r>
+        <w:rPr>
+          <w:i/>
+        </w:rPr>
+        <w:t xml:space="preserve">2011</w:t>
+      </w:r>
+    </w:p>
+    <w:p>
+      <w:r>
+        <w:pict>
+          <v:rect style="width:0;height:1.5pt" o:hralign="center" o:hrstd="t" o:hr="t"/>
+        </w:pict>
+      </w:r>
+    </w:p>
+    <w:p>
+      <w:pPr>
+        <w:pStyle w:val="Heading1"/>
+      </w:pPr>
+      <w:bookmarkStart w:id="106" w:name="tools-technologies"/>
+      <w:r>
+        <w:t xml:space="preserve">Tools &amp; Technologies</w:t>
+      </w:r>
+      <w:bookmarkEnd w:id="106"/>
     </w:p>
     <w:p>
       <w:pPr>
@@ -1220,370 +3113,251 @@
         <w:rPr>
           <w:b/>
         </w:rPr>
-        <w:t xml:space="preserve">Holtzweb, Denver, CO</w:t>
-      </w:r>
-      <w:r>
-        <w:t xml:space="preserve"> </w:t>
-      </w:r>
-      <w:r>
-        <w:t xml:space="preserve">-</w:t>
-      </w:r>
-      <w:r>
-        <w:t xml:space="preserve"> </w:t>
-      </w:r>
-      <w:r>
-        <w:rPr>
-          <w:b/>
-        </w:rPr>
-        <w:t xml:space="preserve">2019 - Present</w:t>
-      </w:r>
-    </w:p>
-    <w:p>
-      <w:pPr>
-        <w:numPr>
-          <w:ilvl w:val="0"/>
-          <w:numId w:val="1030"/>
-        </w:numPr>
-        <w:pStyle w:val="Compact"/>
-      </w:pPr>
-      <w:r>
-        <w:t xml:space="preserve">• Established clients’ cloud based hosting environments, virtualization, and operations infrastructure.</w:t>
-      </w:r>
-    </w:p>
-    <w:p>
-      <w:pPr>
-        <w:numPr>
-          <w:ilvl w:val="0"/>
-          <w:numId w:val="1030"/>
-        </w:numPr>
-        <w:pStyle w:val="Compact"/>
-      </w:pPr>
-      <w:r>
-        <w:t xml:space="preserve">• Strategized SEO/SEM campaigns across web presence including blogs, email newsletters, ads &amp; promotions resulting in a 40% increase in face to face traffic and web traffic.</w:t>
-      </w:r>
-    </w:p>
-    <w:p>
-      <w:pPr>
-        <w:pStyle w:val="Heading2"/>
-      </w:pPr>
-      <w:bookmarkStart w:id="62" w:name="web-development-1"/>
-      <w:r>
-        <w:t xml:space="preserve">Web Development</w:t>
-      </w:r>
-      <w:bookmarkEnd w:id="62"/>
-    </w:p>
-    <w:p>
-      <w:pPr>
-        <w:pStyle w:val="FirstParagraph"/>
-      </w:pPr>
-      <w:r>
-        <w:rPr>
-          <w:b/>
-        </w:rPr>
-        <w:t xml:space="preserve">Highline Ideas, 1187, Mayer Networks, Carbondale, IL</w:t>
-      </w:r>
-      <w:r>
-        <w:t xml:space="preserve"> </w:t>
-      </w:r>
-      <w:r>
-        <w:t xml:space="preserve">-</w:t>
-      </w:r>
-      <w:r>
-        <w:t xml:space="preserve"> </w:t>
-      </w:r>
-      <w:r>
-        <w:rPr>
-          <w:b/>
-        </w:rPr>
-        <w:t xml:space="preserve">2013 - 2017</w:t>
-      </w:r>
-    </w:p>
-    <w:p>
-      <w:pPr>
-        <w:numPr>
-          <w:ilvl w:val="0"/>
-          <w:numId w:val="1031"/>
-        </w:numPr>
-        <w:pStyle w:val="Compact"/>
-      </w:pPr>
-      <w:r>
-        <w:t xml:space="preserve">• Created and designed custom website layout/user interfaces</w:t>
-      </w:r>
-    </w:p>
-    <w:p>
-      <w:pPr>
-        <w:numPr>
-          <w:ilvl w:val="0"/>
-          <w:numId w:val="1031"/>
-        </w:numPr>
-        <w:pStyle w:val="Compact"/>
-      </w:pPr>
-      <w:r>
-        <w:t xml:space="preserve">• Integrated data from various back-end services and databases</w:t>
-      </w:r>
-    </w:p>
-    <w:p>
-      <w:pPr>
-        <w:numPr>
-          <w:ilvl w:val="1"/>
-          <w:numId w:val="1032"/>
-        </w:numPr>
-        <w:pStyle w:val="Compact"/>
-      </w:pPr>
-      <w:r>
-        <w:t xml:space="preserve">election data, employee database, interactive event map</w:t>
-      </w:r>
-    </w:p>
-    <w:p>
-      <w:pPr>
-        <w:numPr>
-          <w:ilvl w:val="0"/>
-          <w:numId w:val="1031"/>
-        </w:numPr>
-        <w:pStyle w:val="Compact"/>
-      </w:pPr>
-      <w:r>
-        <w:t xml:space="preserve">• Worked directly with clients to facilitate business and marking needs</w:t>
-      </w:r>
-    </w:p>
-    <w:p>
-      <w:pPr>
-        <w:numPr>
-          <w:ilvl w:val="0"/>
-          <w:numId w:val="1031"/>
-        </w:numPr>
-        <w:pStyle w:val="Compact"/>
-      </w:pPr>
-      <w:r>
-        <w:t xml:space="preserve">• Executed tests, analyzed data to identify trends and insights using analytics tools and 3rd party optimization tools</w:t>
-      </w:r>
-    </w:p>
-    <w:p>
-      <w:pPr>
-        <w:numPr>
-          <w:ilvl w:val="0"/>
-          <w:numId w:val="1031"/>
-        </w:numPr>
-        <w:pStyle w:val="Compact"/>
-      </w:pPr>
-      <w:r>
-        <w:t xml:space="preserve">• Ensured all site development follows web standards and ADA compliance for accessibility.</w:t>
-      </w:r>
-    </w:p>
-    <w:p>
-      <w:pPr>
-        <w:numPr>
-          <w:ilvl w:val="0"/>
-          <w:numId w:val="1031"/>
-        </w:numPr>
-        <w:pStyle w:val="Compact"/>
-      </w:pPr>
-      <w:r>
-        <w:t xml:space="preserve">• Executed SEO-based initiatives, including website analytics and optimization.</w:t>
-      </w:r>
-    </w:p>
-    <w:p>
-      <w:pPr>
-        <w:numPr>
-          <w:ilvl w:val="0"/>
-          <w:numId w:val="1031"/>
-        </w:numPr>
-        <w:pStyle w:val="Compact"/>
-      </w:pPr>
-      <w:r>
-        <w:t xml:space="preserve">• Fixed broken installs, hacked sites, busted databases, and never-been-updated themes/plugins.</w:t>
-      </w:r>
-    </w:p>
-    <w:p>
-      <w:pPr>
-        <w:numPr>
-          <w:ilvl w:val="0"/>
-          <w:numId w:val="1031"/>
-        </w:numPr>
-        <w:pStyle w:val="Compact"/>
-      </w:pPr>
-      <w:r>
-        <w:t xml:space="preserve">• Repaired, updated, and redesigned new &amp; existing sites.</w:t>
-      </w:r>
-    </w:p>
-    <w:p>
-      <w:pPr>
-        <w:numPr>
-          <w:ilvl w:val="0"/>
-          <w:numId w:val="1031"/>
-        </w:numPr>
-        <w:pStyle w:val="Compact"/>
-      </w:pPr>
-      <w:r>
-        <w:t xml:space="preserve">• Designed custom website layout/user interfaces and custom backends to meet project deadline/requirements.</w:t>
-      </w:r>
-    </w:p>
-    <w:p>
-      <w:pPr>
-        <w:pStyle w:val="Heading1"/>
-      </w:pPr>
-      <w:bookmarkStart w:id="63" w:name="education-and-training"/>
-      <w:r>
-        <w:t xml:space="preserve">Education and Training</w:t>
-      </w:r>
-      <w:bookmarkEnd w:id="63"/>
-    </w:p>
-    <w:p>
-      <w:pPr>
-        <w:pStyle w:val="FirstParagraph"/>
-      </w:pPr>
-      <w:r>
-        <w:rPr>
-          <w:b/>
-        </w:rPr>
-        <w:t xml:space="preserve">2011</w:t>
-      </w:r>
-      <w:r>
-        <w:t xml:space="preserve"> </w:t>
-      </w:r>
-      <w:r>
-        <w:t xml:space="preserve">-</w:t>
-      </w:r>
-      <w:r>
-        <w:t xml:space="preserve"> </w:t>
-      </w:r>
-      <w:r>
-        <w:rPr>
-          <w:i/>
-        </w:rPr>
-        <w:t xml:space="preserve">BS in Finance</w:t>
-      </w:r>
-      <w:r>
-        <w:t xml:space="preserve"> </w:t>
-      </w:r>
-      <w:r>
-        <w:t xml:space="preserve">Southern Illinois University</w:t>
-      </w:r>
-    </w:p>
-    <w:p>
-      <w:pPr>
-        <w:pStyle w:val="BodyText"/>
-      </w:pPr>
-      <w:r>
-        <w:rPr>
-          <w:i/>
-        </w:rPr>
-        <w:t xml:space="preserve">Linux Foundation Certified System Administrator (LFCS): expected July 24th</w:t>
-      </w:r>
-    </w:p>
-    <w:p>
-      <w:pPr>
-        <w:pStyle w:val="Heading1"/>
-      </w:pPr>
-      <w:bookmarkStart w:id="64" w:name="tools"/>
-      <w:r>
-        <w:t xml:space="preserve">Tools</w:t>
-      </w:r>
-      <w:bookmarkEnd w:id="64"/>
-    </w:p>
-    <w:p>
-      <w:pPr>
-        <w:pStyle w:val="Heading2"/>
-      </w:pPr>
-      <w:bookmarkStart w:id="65" w:name="software-used"/>
-      <w:r>
-        <w:t xml:space="preserve">Software Used</w:t>
-      </w:r>
-      <w:bookmarkEnd w:id="65"/>
-    </w:p>
-    <w:p>
-      <w:pPr>
-        <w:pStyle w:val="FirstParagraph"/>
-      </w:pPr>
-      <w:r>
-        <w:t xml:space="preserve">Linux, bash scripting, Python, HTML, CSS, JavaScript, MySQL, Apache, Nginx, HAProxy, Traefik, Samba, Windows Server, Active Directory, GIT, VMWare vSphere, ESXi, libvert, QEMU, KVM, Xen, Hyper-V, Nagios, Docker, Vagrant, Ansible, Jenkins, Puppet, Chef, SaltStack, Helm, Kubernetes, Terraform, AWS, GCP, Oracle Cloud, Microsoft Azure, Private Cloud Hosting, Red Hat Linux (RHEL), CentOS, Debian, Ubuntu, OpenSUSE, Android, Adobe Photoshop</w:t>
-      </w:r>
-    </w:p>
-    <w:p>
-      <w:pPr>
-        <w:pStyle w:val="Heading3"/>
-      </w:pPr>
-      <w:bookmarkStart w:id="66" w:name="web-development-tools"/>
-      <w:r>
-        <w:t xml:space="preserve">Web Development Tools</w:t>
-      </w:r>
-      <w:bookmarkEnd w:id="66"/>
-    </w:p>
-    <w:p>
-      <w:pPr>
-        <w:numPr>
-          <w:ilvl w:val="0"/>
-          <w:numId w:val="1033"/>
-        </w:numPr>
-      </w:pPr>
-      <w:r>
-        <w:t xml:space="preserve">• CMS: WordPress, Drupal, DNN, Joomla</w:t>
-      </w:r>
-    </w:p>
-    <w:p>
-      <w:pPr>
-        <w:numPr>
-          <w:ilvl w:val="0"/>
-          <w:numId w:val="1033"/>
-        </w:numPr>
-      </w:pPr>
-      <w:r>
-        <w:t xml:space="preserve">• SEO: Google Analytics, Piwik, MOZ, SEMRush, Megalytic</w:t>
-      </w:r>
-    </w:p>
-    <w:p>
-      <w:pPr>
-        <w:numPr>
-          <w:ilvl w:val="0"/>
-          <w:numId w:val="1033"/>
-        </w:numPr>
-      </w:pPr>
-      <w:r>
-        <w:t xml:space="preserve">• Design: Adobe Creative Cloud: After Effects, Illustrator, Photoshop</w:t>
-      </w:r>
-    </w:p>
-    <w:p>
-      <w:pPr>
-        <w:numPr>
-          <w:ilvl w:val="0"/>
-          <w:numId w:val="1033"/>
-        </w:numPr>
-      </w:pPr>
-      <w:r>
-        <w:t xml:space="preserve">• Webserver: Apache, Nginx</w:t>
-      </w:r>
-    </w:p>
-    <w:p>
-      <w:pPr>
-        <w:numPr>
-          <w:ilvl w:val="0"/>
-          <w:numId w:val="1033"/>
-        </w:numPr>
-      </w:pPr>
-      <w:r>
-        <w:t xml:space="preserve">• Database: MySQL,Postgres, MariaDB, Redis, MongoDB</w:t>
-      </w:r>
-    </w:p>
-    <w:p>
-      <w:pPr>
-        <w:numPr>
-          <w:ilvl w:val="0"/>
-          <w:numId w:val="1033"/>
-        </w:numPr>
-      </w:pPr>
-      <w:r>
-        <w:t xml:space="preserve">• CSS Boilerplate: Bootstrap, Foundation, Tailwind</w:t>
-      </w:r>
-    </w:p>
-    <w:p>
-      <w:pPr>
-        <w:numPr>
-          <w:ilvl w:val="0"/>
-          <w:numId w:val="1033"/>
-        </w:numPr>
-      </w:pPr>
-      <w:r>
-        <w:t xml:space="preserve">• Cloud: Azure, AWS, DigitalOcean, Cloudflare</w:t>
+        <w:t xml:space="preserve">Operating Systems:</w:t>
+      </w:r>
+      <w:r>
+        <w:t xml:space="preserve"> </w:t>
+      </w:r>
+      <w:r>
+        <w:t xml:space="preserve">Linux (Debian, Ubuntu, RHEL/CentOS, OpenSUSE, Alpine), FreeBSD, Windows Server</w:t>
+      </w:r>
+    </w:p>
+    <w:p>
+      <w:pPr>
+        <w:pStyle w:val="BodyText"/>
+      </w:pPr>
+      <w:r>
+        <w:rPr>
+          <w:b/>
+        </w:rPr>
+        <w:t xml:space="preserve">Infrastructure &amp; Virtualization:</w:t>
+      </w:r>
+      <w:r>
+        <w:t xml:space="preserve"> </w:t>
+      </w:r>
+      <w:r>
+        <w:t xml:space="preserve">Proxmox, QEMU/KVM, VMware ESXi/vSphere, Hyper-V, Xen, libvirt, Vagrant</w:t>
+      </w:r>
+    </w:p>
+    <w:p>
+      <w:pPr>
+        <w:pStyle w:val="BodyText"/>
+      </w:pPr>
+      <w:r>
+        <w:rPr>
+          <w:b/>
+        </w:rPr>
+        <w:t xml:space="preserve">Containers &amp; Orchestration:</w:t>
+      </w:r>
+      <w:r>
+        <w:t xml:space="preserve"> </w:t>
+      </w:r>
+      <w:r>
+        <w:t xml:space="preserve">Docker, Docker Compose, LXC, containerd, Kubernetes, Docker Swarm, Helm</w:t>
+      </w:r>
+    </w:p>
+    <w:p>
+      <w:pPr>
+        <w:pStyle w:val="BodyText"/>
+      </w:pPr>
+      <w:r>
+        <w:rPr>
+          <w:b/>
+        </w:rPr>
+        <w:t xml:space="preserve">Networking &amp; Security:</w:t>
+      </w:r>
+      <w:r>
+        <w:t xml:space="preserve"> </w:t>
+      </w:r>
+      <w:r>
+        <w:t xml:space="preserve">OPNsense, pfSense, OpenWRT, HAProxy, Traefik, Nginx, Caddy, WireGuard, OpenVPN, Suricata, CrowdSec, SecurityOnion, nzyme, Unbound, PowerDNS, BIND, DNSCrypt, DNSSEC</w:t>
+      </w:r>
+    </w:p>
+    <w:p>
+      <w:pPr>
+        <w:pStyle w:val="BodyText"/>
+      </w:pPr>
+      <w:r>
+        <w:rPr>
+          <w:b/>
+        </w:rPr>
+        <w:t xml:space="preserve">Identity &amp; Access Management (IAM):</w:t>
+      </w:r>
+      <w:r>
+        <w:t xml:space="preserve"> </w:t>
+      </w:r>
+      <w:r>
+        <w:t xml:space="preserve">Authentik, Keycloak, Active Directory, OpenLDAP, RADIUS, OAuth2, OpenID Connect, Kerberos</w:t>
+      </w:r>
+    </w:p>
+    <w:p>
+      <w:pPr>
+        <w:pStyle w:val="BodyText"/>
+      </w:pPr>
+      <w:r>
+        <w:rPr>
+          <w:b/>
+        </w:rPr>
+        <w:t xml:space="preserve">Monitoring &amp; Observability:</w:t>
+      </w:r>
+      <w:r>
+        <w:t xml:space="preserve"> </w:t>
+      </w:r>
+      <w:r>
+        <w:t xml:space="preserve">Prometheus, Grafana, Loki, Alloy, ELK Stack, Netdata, Glances, Diskover, Promtail</w:t>
+      </w:r>
+    </w:p>
+    <w:p>
+      <w:pPr>
+        <w:pStyle w:val="BodyText"/>
+      </w:pPr>
+      <w:r>
+        <w:rPr>
+          <w:b/>
+        </w:rPr>
+        <w:t xml:space="preserve">Automation &amp; IaC:</w:t>
+      </w:r>
+      <w:r>
+        <w:t xml:space="preserve"> </w:t>
+      </w:r>
+      <w:r>
+        <w:t xml:space="preserve">Ansible, Terraform, Helm, ArgoCD, Chef, Puppet, SaltStack, OpenStack, GitHub Actions, GitLab CI, Jenkins, Cloud-init, n8n</w:t>
+      </w:r>
+    </w:p>
+    <w:p>
+      <w:pPr>
+        <w:pStyle w:val="BodyText"/>
+      </w:pPr>
+      <w:r>
+        <w:rPr>
+          <w:b/>
+        </w:rPr>
+        <w:t xml:space="preserve">Cloud Platforms:</w:t>
+      </w:r>
+      <w:r>
+        <w:t xml:space="preserve"> </w:t>
+      </w:r>
+      <w:r>
+        <w:t xml:space="preserve">AWS (EC2, RDS, S3, ALB/ELB), Microsoft Azure, GCP, Oracle Cloud, DigitalOcean, Cloudflare</w:t>
+      </w:r>
+    </w:p>
+    <w:p>
+      <w:pPr>
+        <w:pStyle w:val="BodyText"/>
+      </w:pPr>
+      <w:r>
+        <w:rPr>
+          <w:b/>
+        </w:rPr>
+        <w:t xml:space="preserve">Languages &amp; Scripting:</w:t>
+      </w:r>
+      <w:r>
+        <w:t xml:space="preserve"> </w:t>
+      </w:r>
+      <w:r>
+        <w:t xml:space="preserve">Bash, Python, JavaScript, TypeScript, HTML, CSS</w:t>
+      </w:r>
+    </w:p>
+    <w:p>
+      <w:pPr>
+        <w:pStyle w:val="BodyText"/>
+      </w:pPr>
+      <w:r>
+        <w:rPr>
+          <w:b/>
+        </w:rPr>
+        <w:t xml:space="preserve">Databases:</w:t>
+      </w:r>
+      <w:r>
+        <w:t xml:space="preserve"> </w:t>
+      </w:r>
+      <w:r>
+        <w:t xml:space="preserve">MySQL, PostgreSQL, MariaDB, Redis, MongoDB, SQLite</w:t>
+      </w:r>
+    </w:p>
+    <w:p>
+      <w:pPr>
+        <w:pStyle w:val="BodyText"/>
+      </w:pPr>
+      <w:r>
+        <w:rPr>
+          <w:b/>
+        </w:rPr>
+        <w:t xml:space="preserve">Web &amp; Front-End:</w:t>
+      </w:r>
+      <w:r>
+        <w:t xml:space="preserve"> </w:t>
+      </w:r>
+      <w:r>
+        <w:t xml:space="preserve">React, TypeScript, WordPress, Drupal, Joomla, DNN, Hugo, Astro, Apache, Nginx, Tailwind CSS, Bootstrap, Foundation</w:t>
+      </w:r>
+    </w:p>
+    <w:p>
+      <w:pPr>
+        <w:pStyle w:val="BodyText"/>
+      </w:pPr>
+      <w:r>
+        <w:rPr>
+          <w:b/>
+        </w:rPr>
+        <w:t xml:space="preserve">Version Control:</w:t>
+      </w:r>
+      <w:r>
+        <w:t xml:space="preserve"> </w:t>
+      </w:r>
+      <w:r>
+        <w:t xml:space="preserve">Git, GitHub, GitLab</w:t>
+      </w:r>
+    </w:p>
+    <w:p>
+      <w:pPr>
+        <w:pStyle w:val="BodyText"/>
+      </w:pPr>
+      <w:r>
+        <w:rPr>
+          <w:b/>
+        </w:rPr>
+        <w:t xml:space="preserve">Storage:</w:t>
+      </w:r>
+      <w:r>
+        <w:t xml:space="preserve"> </w:t>
+      </w:r>
+      <w:r>
+        <w:t xml:space="preserve">ZFS (OpenZFS), NFS, Ceph, S3-compatible object storage, Sanoid/Syncoid</w:t>
+      </w:r>
+    </w:p>
+    <w:p>
+      <w:pPr>
+        <w:pStyle w:val="BodyText"/>
+      </w:pPr>
+      <w:r>
+        <w:rPr>
+          <w:b/>
+        </w:rPr>
+        <w:t xml:space="preserve">Design:</w:t>
+      </w:r>
+      <w:r>
+        <w:t xml:space="preserve"> </w:t>
+      </w:r>
+      <w:r>
+        <w:t xml:space="preserve">Adobe Creative Cloud (Photoshop, Illustrator, After Effects), LaTeX, Markdown</w:t>
+      </w:r>
+    </w:p>
+    <w:p>
+      <w:pPr>
+        <w:pStyle w:val="BodyText"/>
+      </w:pPr>
+      <w:r>
+        <w:rPr>
+          <w:b/>
+        </w:rPr>
+        <w:t xml:space="preserve">SEO &amp; Analytics:</w:t>
+      </w:r>
+      <w:r>
+        <w:t xml:space="preserve"> </w:t>
+      </w:r>
+      <w:r>
+        <w:t xml:space="preserve">Google Analytics, Matomo/Piwik, MOZ, SEMrush, Megalytic</w:t>
       </w:r>
     </w:p>
     <w:sectPr/>
@@ -1871,57 +3645,6 @@
     <w:abstractNumId w:val="991"/>
   </w:num>
   <w:num w:numId="1016">
-    <w:abstractNumId w:val="991"/>
-  </w:num>
-  <w:num w:numId="1017">
-    <w:abstractNumId w:val="991"/>
-  </w:num>
-  <w:num w:numId="1018">
-    <w:abstractNumId w:val="991"/>
-  </w:num>
-  <w:num w:numId="1019">
-    <w:abstractNumId w:val="991"/>
-  </w:num>
-  <w:num w:numId="1020">
-    <w:abstractNumId w:val="991"/>
-  </w:num>
-  <w:num w:numId="1021">
-    <w:abstractNumId w:val="991"/>
-  </w:num>
-  <w:num w:numId="1022">
-    <w:abstractNumId w:val="991"/>
-  </w:num>
-  <w:num w:numId="1023">
-    <w:abstractNumId w:val="991"/>
-  </w:num>
-  <w:num w:numId="1024">
-    <w:abstractNumId w:val="991"/>
-  </w:num>
-  <w:num w:numId="1025">
-    <w:abstractNumId w:val="991"/>
-  </w:num>
-  <w:num w:numId="1026">
-    <w:abstractNumId w:val="991"/>
-  </w:num>
-  <w:num w:numId="1027">
-    <w:abstractNumId w:val="991"/>
-  </w:num>
-  <w:num w:numId="1028">
-    <w:abstractNumId w:val="991"/>
-  </w:num>
-  <w:num w:numId="1029">
-    <w:abstractNumId w:val="991"/>
-  </w:num>
-  <w:num w:numId="1030">
-    <w:abstractNumId w:val="991"/>
-  </w:num>
-  <w:num w:numId="1031">
-    <w:abstractNumId w:val="991"/>
-  </w:num>
-  <w:num w:numId="1032">
-    <w:abstractNumId w:val="991"/>
-  </w:num>
-  <w:num w:numId="1033">
     <w:abstractNumId w:val="991"/>
   </w:num>
 </w:numbering>

</xml_diff>